<commit_message>
Add Extra steel taps
</commit_message>
<xml_diff>
--- a/التعامل مع مشاريع AntiGravity.docx
+++ b/التعامل مع مشاريع AntiGravity.docx
@@ -7,7 +7,6 @@
         <w:bidi/>
         <w:jc w:val="center"/>
         <w:rPr>
-          <w:rFonts w:hint="cs"/>
           <w:b/>
           <w:bCs/>
           <w:color w:val="FF0000"/>
@@ -31,6 +30,7 @@
         </w:rPr>
         <w:t xml:space="preserve">التعامل مع مشاريع </w:t>
       </w:r>
+      <w:proofErr w:type="spellStart"/>
       <w:r>
         <w:rPr>
           <w:b/>
@@ -43,12 +43,12 @@
         </w:rPr>
         <w:t>AntiGravity</w:t>
       </w:r>
-    </w:p>
-    <w:p>
-      <w:pPr>
-        <w:bidi/>
-        <w:rPr>
-          <w:rFonts w:hint="cs"/>
+      <w:proofErr w:type="spellEnd"/>
+    </w:p>
+    <w:p>
+      <w:pPr>
+        <w:bidi/>
+        <w:rPr>
           <w:b/>
           <w:bCs/>
           <w:color w:val="0070C0"/>
@@ -149,50 +149,51 @@
           <w:rFonts w:cs="Arial"/>
           <w:rtl/>
         </w:rPr>
+        <w:t xml:space="preserve"> ثم نكتب</w:t>
+      </w:r>
+      <w:r>
         <w:t xml:space="preserve"> </w:t>
       </w:r>
+      <w:proofErr w:type="spellStart"/>
+      <w:r>
+        <w:t>cmd</w:t>
+      </w:r>
+      <w:proofErr w:type="spellEnd"/>
+      <w:r>
+        <w:t xml:space="preserve"> </w:t>
+      </w:r>
       <w:r>
         <w:rPr>
           <w:rFonts w:cs="Arial"/>
           <w:rtl/>
         </w:rPr>
-        <w:t>ثم نكتب</w:t>
-      </w:r>
-      <w:r>
-        <w:t xml:space="preserve"> cmd </w:t>
+        <w:t xml:space="preserve">من سطر الاكسبلورو مكان </w:t>
       </w:r>
       <w:r>
         <w:rPr>
           <w:rFonts w:cs="Arial"/>
-          <w:rtl/>
-        </w:rPr>
-        <w:t xml:space="preserve">من سطر الاكسبلورو مكان </w:t>
+        </w:rPr>
+        <w:t xml:space="preserve">Address </w:t>
+      </w:r>
+      <w:r>
+        <w:rPr>
+          <w:rFonts w:cs="Arial" w:hint="cs"/>
+          <w:rtl/>
+          <w:lang w:bidi="ar-EG"/>
+        </w:rPr>
+        <w:t xml:space="preserve"> اعلي الشاشة </w:t>
       </w:r>
       <w:r>
         <w:rPr>
           <w:rFonts w:cs="Arial"/>
-        </w:rPr>
-        <w:t xml:space="preserve">Address </w:t>
+          <w:rtl/>
+        </w:rPr>
+        <w:t xml:space="preserve">  ... لضمان الوقوف علي فولد اللي انا عايزة</w:t>
       </w:r>
       <w:r>
         <w:rPr>
           <w:rFonts w:cs="Arial" w:hint="cs"/>
           <w:rtl/>
-          <w:lang w:bidi="ar-EG"/>
-        </w:rPr>
-        <w:t xml:space="preserve"> اعلي الشاشة </w:t>
-      </w:r>
-      <w:r>
-        <w:rPr>
-          <w:rFonts w:cs="Arial"/>
-          <w:rtl/>
-        </w:rPr>
-        <w:t xml:space="preserve">  ... لضمان الوقوف علي فولد اللي انا عايزة</w:t>
-      </w:r>
-      <w:r>
-        <w:rPr>
-          <w:rFonts w:cs="Arial" w:hint="cs"/>
-          <w:rtl/>
         </w:rPr>
         <w:t xml:space="preserve"> </w:t>
       </w:r>
@@ -262,7 +263,6 @@
       <w:pPr>
         <w:bidi/>
         <w:rPr>
-          <w:rFonts w:hint="cs"/>
           <w:b/>
           <w:bCs/>
           <w:u w:val="single"/>
@@ -281,6 +281,7 @@
         </w:rPr>
         <w:t xml:space="preserve">يختلف من مشروع الي مشروع ويحتاج نسال </w:t>
       </w:r>
+      <w:proofErr w:type="spellStart"/>
       <w:r>
         <w:rPr>
           <w:b/>
@@ -290,6 +291,7 @@
         </w:rPr>
         <w:t>AntiGravity</w:t>
       </w:r>
+      <w:proofErr w:type="spellEnd"/>
       <w:r>
         <w:rPr>
           <w:rFonts w:hint="cs"/>
@@ -311,7 +313,6 @@
         </w:numPr>
         <w:bidi/>
         <w:rPr>
-          <w:rFonts w:hint="cs"/>
           <w:b/>
           <w:bCs/>
           <w:u w:val="single"/>
@@ -356,8 +357,31 @@
           <w:bCs/>
           <w:sz w:val="28"/>
           <w:szCs w:val="28"/>
-        </w:rPr>
-        <w:t>python -m streamlit run app.py</w:t>
+          <w:highlight w:val="yellow"/>
+        </w:rPr>
+        <w:t xml:space="preserve">python -m </w:t>
+      </w:r>
+      <w:proofErr w:type="spellStart"/>
+      <w:r>
+        <w:rPr>
+          <w:b/>
+          <w:bCs/>
+          <w:sz w:val="28"/>
+          <w:szCs w:val="28"/>
+          <w:highlight w:val="yellow"/>
+        </w:rPr>
+        <w:t>streamlit</w:t>
+      </w:r>
+      <w:proofErr w:type="spellEnd"/>
+      <w:r>
+        <w:rPr>
+          <w:b/>
+          <w:bCs/>
+          <w:sz w:val="28"/>
+          <w:szCs w:val="28"/>
+          <w:highlight w:val="yellow"/>
+        </w:rPr>
+        <w:t xml:space="preserve"> run app.py</w:t>
       </w:r>
     </w:p>
     <w:p>
@@ -395,7 +419,6 @@
         <w:pStyle w:val="ListParagraph"/>
         <w:bidi/>
         <w:rPr>
-          <w:rFonts w:hint="cs"/>
           <w:b/>
           <w:bCs/>
           <w:u w:val="single"/>
@@ -444,6 +467,7 @@
         <w:rPr>
           <w:b/>
           <w:bCs/>
+          <w:rtl/>
           <w:lang w:bidi="ar-EG"/>
         </w:rPr>
       </w:pPr>
@@ -500,16 +524,44 @@
           <w:rtl/>
           <w:lang w:bidi="ar-EG"/>
         </w:rPr>
-        <w:t xml:space="preserve"> لمنصة </w:t>
-      </w:r>
-      <w:r>
-        <w:rPr>
+        <w:t xml:space="preserve"> </w:t>
+      </w:r>
+      <w:r>
+        <w:rPr>
+          <w:rFonts w:hint="cs"/>
           <w:b/>
           <w:bCs/>
           <w:color w:val="0070C0"/>
           <w:sz w:val="28"/>
           <w:szCs w:val="28"/>
           <w:u w:val="single"/>
+          <w:rtl/>
+          <w:lang w:bidi="ar-EG"/>
+        </w:rPr>
+        <w:t>للمشاريع ب</w:t>
+      </w:r>
+      <w:r>
+        <w:rPr>
+          <w:rFonts w:hint="cs"/>
+          <w:b/>
+          <w:bCs/>
+          <w:color w:val="0070C0"/>
+          <w:sz w:val="28"/>
+          <w:szCs w:val="28"/>
+          <w:u w:val="single"/>
+          <w:rtl/>
+          <w:lang w:bidi="ar-EG"/>
+        </w:rPr>
+        <w:t xml:space="preserve">منصة </w:t>
+      </w:r>
+      <w:r>
+        <w:rPr>
+          <w:b/>
+          <w:bCs/>
+          <w:color w:val="0070C0"/>
+          <w:sz w:val="28"/>
+          <w:szCs w:val="28"/>
+          <w:u w:val="single"/>
           <w:lang w:bidi="ar-EG"/>
         </w:rPr>
         <w:t>Git Hub</w:t>
@@ -526,20 +578,237 @@
           <w:rtl/>
           <w:lang w:bidi="ar-EG"/>
         </w:rPr>
-        <w:t xml:space="preserve"> بعد التعديل في المشروع</w:t>
-      </w:r>
-    </w:p>
-    <w:p>
-      <w:pPr>
-        <w:bidi/>
-        <w:rPr>
-          <w:rFonts w:hint="cs"/>
-          <w:b/>
-          <w:bCs/>
-          <w:rtl/>
-          <w:lang w:bidi="ar-EG"/>
-        </w:rPr>
-      </w:pPr>
+        <w:t xml:space="preserve"> بعد التعديل في</w:t>
+      </w:r>
+      <w:r>
+        <w:rPr>
+          <w:rFonts w:hint="cs"/>
+          <w:b/>
+          <w:bCs/>
+          <w:color w:val="0070C0"/>
+          <w:sz w:val="28"/>
+          <w:szCs w:val="28"/>
+          <w:u w:val="single"/>
+          <w:rtl/>
+          <w:lang w:bidi="ar-EG"/>
+        </w:rPr>
+        <w:t>ها</w:t>
+      </w:r>
+    </w:p>
+    <w:p>
+      <w:pPr>
+        <w:bidi/>
+        <w:rPr>
+          <w:b/>
+          <w:bCs/>
+          <w:rtl/>
+          <w:lang w:bidi="ar-EG"/>
+        </w:rPr>
+      </w:pPr>
+      <w:r>
+        <w:rPr>
+          <w:noProof/>
+        </w:rPr>
+        <mc:AlternateContent>
+          <mc:Choice Requires="wps">
+            <w:drawing>
+              <wp:anchor distT="0" distB="0" distL="114300" distR="114300" simplePos="0" relativeHeight="251663360" behindDoc="0" locked="0" layoutInCell="1" allowOverlap="1" wp14:anchorId="3F1326CF" wp14:editId="4B3C2154">
+                <wp:simplePos x="0" y="0"/>
+                <wp:positionH relativeFrom="column">
+                  <wp:posOffset>965744</wp:posOffset>
+                </wp:positionH>
+                <wp:positionV relativeFrom="paragraph">
+                  <wp:posOffset>1031059</wp:posOffset>
+                </wp:positionV>
+                <wp:extent cx="1344386" cy="5443"/>
+                <wp:effectExtent l="19050" t="19050" r="8255" b="33020"/>
+                <wp:wrapNone/>
+                <wp:docPr id="4" name="Straight Connector 4"/>
+                <wp:cNvGraphicFramePr/>
+                <a:graphic xmlns:a="http://schemas.openxmlformats.org/drawingml/2006/main">
+                  <a:graphicData uri="http://schemas.microsoft.com/office/word/2010/wordprocessingShape">
+                    <wps:wsp>
+                      <wps:cNvCnPr/>
+                      <wps:spPr>
+                        <a:xfrm flipH="1">
+                          <a:off x="0" y="0"/>
+                          <a:ext cx="1344386" cy="5443"/>
+                        </a:xfrm>
+                        <a:prstGeom prst="line">
+                          <a:avLst/>
+                        </a:prstGeom>
+                        <a:ln w="38100">
+                          <a:solidFill>
+                            <a:srgbClr val="FF0000"/>
+                          </a:solidFill>
+                        </a:ln>
+                      </wps:spPr>
+                      <wps:style>
+                        <a:lnRef idx="1">
+                          <a:schemeClr val="accent1"/>
+                        </a:lnRef>
+                        <a:fillRef idx="0">
+                          <a:schemeClr val="accent1"/>
+                        </a:fillRef>
+                        <a:effectRef idx="0">
+                          <a:schemeClr val="accent1"/>
+                        </a:effectRef>
+                        <a:fontRef idx="minor">
+                          <a:schemeClr val="tx1"/>
+                        </a:fontRef>
+                      </wps:style>
+                      <wps:bodyPr/>
+                    </wps:wsp>
+                  </a:graphicData>
+                </a:graphic>
+              </wp:anchor>
+            </w:drawing>
+          </mc:Choice>
+          <mc:Fallback>
+            <w:pict>
+              <v:line w14:anchorId="0F22A862" id="Straight Connector 4" o:spid="_x0000_s1026" style="position:absolute;flip:x;z-index:251663360;visibility:visible;mso-wrap-style:square;mso-wrap-distance-left:9pt;mso-wrap-distance-top:0;mso-wrap-distance-right:9pt;mso-wrap-distance-bottom:0;mso-position-horizontal:absolute;mso-position-horizontal-relative:text;mso-position-vertical:absolute;mso-position-vertical-relative:text" from="76.05pt,81.2pt" to="181.9pt,81.65pt" o:gfxdata="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" strokecolor="red" strokeweight="3pt">
+                <v:stroke joinstyle="miter"/>
+              </v:line>
+            </w:pict>
+          </mc:Fallback>
+        </mc:AlternateContent>
+      </w:r>
+      <w:r>
+        <w:rPr>
+          <w:noProof/>
+        </w:rPr>
+        <mc:AlternateContent>
+          <mc:Choice Requires="wps">
+            <w:drawing>
+              <wp:anchor distT="0" distB="0" distL="114300" distR="114300" simplePos="0" relativeHeight="251661312" behindDoc="0" locked="0" layoutInCell="1" allowOverlap="1" wp14:anchorId="725E12FF" wp14:editId="4327F180">
+                <wp:simplePos x="0" y="0"/>
+                <wp:positionH relativeFrom="column">
+                  <wp:posOffset>24402</wp:posOffset>
+                </wp:positionH>
+                <wp:positionV relativeFrom="paragraph">
+                  <wp:posOffset>824230</wp:posOffset>
+                </wp:positionV>
+                <wp:extent cx="1344386" cy="5443"/>
+                <wp:effectExtent l="19050" t="19050" r="8255" b="33020"/>
+                <wp:wrapNone/>
+                <wp:docPr id="3" name="Straight Connector 3"/>
+                <wp:cNvGraphicFramePr/>
+                <a:graphic xmlns:a="http://schemas.openxmlformats.org/drawingml/2006/main">
+                  <a:graphicData uri="http://schemas.microsoft.com/office/word/2010/wordprocessingShape">
+                    <wps:wsp>
+                      <wps:cNvCnPr/>
+                      <wps:spPr>
+                        <a:xfrm flipH="1">
+                          <a:off x="0" y="0"/>
+                          <a:ext cx="1344386" cy="5443"/>
+                        </a:xfrm>
+                        <a:prstGeom prst="line">
+                          <a:avLst/>
+                        </a:prstGeom>
+                        <a:ln w="38100">
+                          <a:solidFill>
+                            <a:srgbClr val="FF0000"/>
+                          </a:solidFill>
+                        </a:ln>
+                      </wps:spPr>
+                      <wps:style>
+                        <a:lnRef idx="1">
+                          <a:schemeClr val="accent1"/>
+                        </a:lnRef>
+                        <a:fillRef idx="0">
+                          <a:schemeClr val="accent1"/>
+                        </a:fillRef>
+                        <a:effectRef idx="0">
+                          <a:schemeClr val="accent1"/>
+                        </a:effectRef>
+                        <a:fontRef idx="minor">
+                          <a:schemeClr val="tx1"/>
+                        </a:fontRef>
+                      </wps:style>
+                      <wps:bodyPr/>
+                    </wps:wsp>
+                  </a:graphicData>
+                </a:graphic>
+              </wp:anchor>
+            </w:drawing>
+          </mc:Choice>
+          <mc:Fallback>
+            <w:pict>
+              <v:line w14:anchorId="2B5E21A6" id="Straight Connector 3" o:spid="_x0000_s1026" style="position:absolute;flip:x;z-index:251661312;visibility:visible;mso-wrap-style:square;mso-wrap-distance-left:9pt;mso-wrap-distance-top:0;mso-wrap-distance-right:9pt;mso-wrap-distance-bottom:0;mso-position-horizontal:absolute;mso-position-horizontal-relative:text;mso-position-vertical:absolute;mso-position-vertical-relative:text" from="1.9pt,64.9pt" to="107.75pt,65.35pt" o:gfxdata="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" strokecolor="red" strokeweight="3pt">
+                <v:stroke joinstyle="miter"/>
+              </v:line>
+            </w:pict>
+          </mc:Fallback>
+        </mc:AlternateContent>
+      </w:r>
+      <w:r>
+        <w:rPr>
+          <w:noProof/>
+        </w:rPr>
+        <mc:AlternateContent>
+          <mc:Choice Requires="wps">
+            <w:drawing>
+              <wp:anchor distT="0" distB="0" distL="114300" distR="114300" simplePos="0" relativeHeight="251659264" behindDoc="0" locked="0" layoutInCell="1" allowOverlap="1" wp14:anchorId="76DA556E" wp14:editId="501701DA">
+                <wp:simplePos x="0" y="0"/>
+                <wp:positionH relativeFrom="column">
+                  <wp:posOffset>70757</wp:posOffset>
+                </wp:positionH>
+                <wp:positionV relativeFrom="paragraph">
+                  <wp:posOffset>1589133</wp:posOffset>
+                </wp:positionV>
+                <wp:extent cx="1344386" cy="5443"/>
+                <wp:effectExtent l="19050" t="19050" r="8255" b="33020"/>
+                <wp:wrapNone/>
+                <wp:docPr id="2" name="Straight Connector 2"/>
+                <wp:cNvGraphicFramePr/>
+                <a:graphic xmlns:a="http://schemas.openxmlformats.org/drawingml/2006/main">
+                  <a:graphicData uri="http://schemas.microsoft.com/office/word/2010/wordprocessingShape">
+                    <wps:wsp>
+                      <wps:cNvCnPr/>
+                      <wps:spPr>
+                        <a:xfrm flipH="1">
+                          <a:off x="0" y="0"/>
+                          <a:ext cx="1344386" cy="5443"/>
+                        </a:xfrm>
+                        <a:prstGeom prst="line">
+                          <a:avLst/>
+                        </a:prstGeom>
+                        <a:ln w="38100">
+                          <a:solidFill>
+                            <a:srgbClr val="FF0000"/>
+                          </a:solidFill>
+                        </a:ln>
+                      </wps:spPr>
+                      <wps:style>
+                        <a:lnRef idx="1">
+                          <a:schemeClr val="accent1"/>
+                        </a:lnRef>
+                        <a:fillRef idx="0">
+                          <a:schemeClr val="accent1"/>
+                        </a:fillRef>
+                        <a:effectRef idx="0">
+                          <a:schemeClr val="accent1"/>
+                        </a:effectRef>
+                        <a:fontRef idx="minor">
+                          <a:schemeClr val="tx1"/>
+                        </a:fontRef>
+                      </wps:style>
+                      <wps:bodyPr/>
+                    </wps:wsp>
+                  </a:graphicData>
+                </a:graphic>
+              </wp:anchor>
+            </w:drawing>
+          </mc:Choice>
+          <mc:Fallback>
+            <w:pict>
+              <v:line w14:anchorId="1118FA51" id="Straight Connector 2" o:spid="_x0000_s1026" style="position:absolute;flip:x;z-index:251659264;visibility:visible;mso-wrap-style:square;mso-wrap-distance-left:9pt;mso-wrap-distance-top:0;mso-wrap-distance-right:9pt;mso-wrap-distance-bottom:0;mso-position-horizontal:absolute;mso-position-horizontal-relative:text;mso-position-vertical:absolute;mso-position-vertical-relative:text" from="5.55pt,125.15pt" to="111.4pt,125.6pt" o:gfxdata="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" strokecolor="red" strokeweight="3pt">
+                <v:stroke joinstyle="miter"/>
+              </v:line>
+            </w:pict>
+          </mc:Fallback>
+        </mc:AlternateContent>
+      </w:r>
       <w:r>
         <w:rPr>
           <w:noProof/>
@@ -666,12 +935,11 @@
       <w:pPr>
         <w:bidi/>
         <w:rPr>
-          <w:b/>
-          <w:bCs/>
-          <w:color w:val="00B0F0"/>
-          <w:sz w:val="28"/>
-          <w:szCs w:val="28"/>
-          <w:rtl/>
+          <w:rStyle w:val="Hyperlink"/>
+          <w:b/>
+          <w:bCs/>
+          <w:sz w:val="28"/>
+          <w:szCs w:val="28"/>
           <w:lang w:bidi="ar-EG"/>
         </w:rPr>
       </w:pPr>
@@ -685,29 +953,7 @@
             <w:szCs w:val="28"/>
             <w:lang w:bidi="ar-EG"/>
           </w:rPr>
-          <w:t>https://</w:t>
-        </w:r>
-        <w:r>
-          <w:rPr>
-            <w:rStyle w:val="Hyperlink"/>
-            <w:b/>
-            <w:bCs/>
-            <w:sz w:val="28"/>
-            <w:szCs w:val="28"/>
-            <w:lang w:bidi="ar-EG"/>
-          </w:rPr>
-          <w:t>g</w:t>
-        </w:r>
-        <w:r>
-          <w:rPr>
-            <w:rStyle w:val="Hyperlink"/>
-            <w:b/>
-            <w:bCs/>
-            <w:sz w:val="28"/>
-            <w:szCs w:val="28"/>
-            <w:lang w:bidi="ar-EG"/>
-          </w:rPr>
-          <w:t>ithub.com/hzayed3030-cell</w:t>
+          <w:t>https://github.com/hzayed3030-cell</w:t>
         </w:r>
       </w:hyperlink>
     </w:p>
@@ -717,6 +963,38 @@
         <w:rPr>
           <w:b/>
           <w:bCs/>
+          <w:lang w:bidi="ar-EG"/>
+        </w:rPr>
+      </w:pPr>
+      <w:r>
+        <w:rPr>
+          <w:rStyle w:val="Hyperlink"/>
+          <w:rFonts w:hint="cs"/>
+          <w:b/>
+          <w:bCs/>
+          <w:color w:val="auto"/>
+          <w:rtl/>
+          <w:lang w:bidi="ar-EG"/>
+        </w:rPr>
+        <w:t xml:space="preserve">اذا كانت الصفحة مفتوحة يجب ان نعمل لها </w:t>
+      </w:r>
+      <w:r>
+        <w:rPr>
+          <w:rStyle w:val="Hyperlink"/>
+          <w:b/>
+          <w:bCs/>
+          <w:color w:val="auto"/>
+          <w:lang w:bidi="ar-EG"/>
+        </w:rPr>
+        <w:t>refresh</w:t>
+      </w:r>
+    </w:p>
+    <w:p>
+      <w:pPr>
+        <w:bidi/>
+        <w:rPr>
+          <w:b/>
+          <w:bCs/>
           <w:sz w:val="24"/>
           <w:szCs w:val="24"/>
           <w:rtl/>
@@ -784,7 +1062,6 @@
       <w:pPr>
         <w:bidi/>
         <w:rPr>
-          <w:rFonts w:hint="cs"/>
           <w:b/>
           <w:bCs/>
           <w:sz w:val="24"/>
@@ -824,6 +1101,7 @@
         <w:jc w:val="right"/>
       </w:pPr>
       <w:r>
+        <w:lastRenderedPageBreak/>
         <w:t>hzayed3030@hotmail</w:t>
       </w:r>
     </w:p>
@@ -833,9 +1111,13 @@
         <w:jc w:val="right"/>
       </w:pPr>
       <w:r>
-        <w:lastRenderedPageBreak/>
-        <w:t>PWNgDGYxf6Tni7cDBTnCmJh!Q</w:t>
-      </w:r>
+        <w:t>PWNgDGYxf6Tni7</w:t>
+      </w:r>
+      <w:proofErr w:type="gramStart"/>
+      <w:r>
+        <w:t>cDBTnCmJh!Q</w:t>
+      </w:r>
+      <w:proofErr w:type="gramEnd"/>
     </w:p>
     <w:p>
       <w:pPr>
@@ -869,8 +1151,13 @@
         <w:bidi/>
         <w:jc w:val="right"/>
       </w:pPr>
-      <w:r>
-        <w:t>QQQqqq@@4600</w:t>
+      <w:proofErr w:type="spellStart"/>
+      <w:r>
+        <w:t>QQQqqq</w:t>
+      </w:r>
+      <w:proofErr w:type="spellEnd"/>
+      <w:r>
+        <w:t>@@4600</w:t>
       </w:r>
     </w:p>
     <w:p>
@@ -887,8 +1174,13 @@
         <w:bidi/>
         <w:jc w:val="right"/>
       </w:pPr>
-      <w:r>
-        <w:t>QQQqqq@@88 - Mobile 01223976846</w:t>
+      <w:proofErr w:type="spellStart"/>
+      <w:r>
+        <w:t>QQQqqq</w:t>
+      </w:r>
+      <w:proofErr w:type="spellEnd"/>
+      <w:r>
+        <w:t>@@88 - Mobile 01223976846</w:t>
       </w:r>
     </w:p>
     <w:p>
@@ -908,8 +1200,13 @@
           <w:rtl/>
         </w:rPr>
       </w:pPr>
-      <w:r>
-        <w:t>QQQqqq@@88 - Mobile 01020232244</w:t>
+      <w:proofErr w:type="spellStart"/>
+      <w:r>
+        <w:t>QQQqqq</w:t>
+      </w:r>
+      <w:proofErr w:type="spellEnd"/>
+      <w:r>
+        <w:t>@@88 - Mobile 01020232244</w:t>
       </w:r>
     </w:p>
     <w:p>

</xml_diff>

<commit_message>
Added QTY columns survey TAP
</commit_message>
<xml_diff>
--- a/التعامل مع مشاريع AntiGravity.docx
+++ b/التعامل مع مشاريع AntiGravity.docx
@@ -30,7 +30,6 @@
         </w:rPr>
         <w:t xml:space="preserve">التعامل مع مشاريع </w:t>
       </w:r>
-      <w:proofErr w:type="spellStart"/>
       <w:r>
         <w:rPr>
           <w:b/>
@@ -43,7 +42,6 @@
         </w:rPr>
         <w:t>AntiGravity</w:t>
       </w:r>
-      <w:proofErr w:type="spellEnd"/>
     </w:p>
     <w:p>
       <w:pPr>
@@ -152,112 +150,104 @@
         <w:t xml:space="preserve"> ثم نكتب</w:t>
       </w:r>
       <w:r>
+        <w:t xml:space="preserve"> cmd </w:t>
+      </w:r>
+      <w:r>
+        <w:rPr>
+          <w:rFonts w:cs="Arial"/>
+          <w:rtl/>
+        </w:rPr>
+        <w:t xml:space="preserve">من سطر الاكسبلورو مكان </w:t>
+      </w:r>
+      <w:r>
+        <w:rPr>
+          <w:rFonts w:cs="Arial"/>
+        </w:rPr>
+        <w:t xml:space="preserve">Address </w:t>
+      </w:r>
+      <w:r>
+        <w:rPr>
+          <w:rFonts w:cs="Arial" w:hint="cs"/>
+          <w:rtl/>
+          <w:lang w:bidi="ar-EG"/>
+        </w:rPr>
+        <w:t xml:space="preserve"> اعلي الشاشة </w:t>
+      </w:r>
+      <w:r>
+        <w:rPr>
+          <w:rFonts w:cs="Arial"/>
+          <w:rtl/>
+        </w:rPr>
+        <w:t xml:space="preserve">  ... لضمان الوقوف علي فولد اللي انا عايزة</w:t>
+      </w:r>
+      <w:r>
+        <w:rPr>
+          <w:rFonts w:cs="Arial" w:hint="cs"/>
+          <w:rtl/>
+        </w:rPr>
         <w:t xml:space="preserve"> </w:t>
       </w:r>
-      <w:proofErr w:type="spellStart"/>
-      <w:r>
-        <w:t>cmd</w:t>
-      </w:r>
-      <w:proofErr w:type="spellEnd"/>
       <w:r>
         <w:t xml:space="preserve"> </w:t>
       </w:r>
       <w:r>
-        <w:rPr>
-          <w:rFonts w:cs="Arial"/>
-          <w:rtl/>
-        </w:rPr>
-        <w:t xml:space="preserve">من سطر الاكسبلورو مكان </w:t>
-      </w:r>
-      <w:r>
-        <w:rPr>
-          <w:rFonts w:cs="Arial"/>
-        </w:rPr>
-        <w:t xml:space="preserve">Address </w:t>
-      </w:r>
-      <w:r>
-        <w:rPr>
-          <w:rFonts w:cs="Arial" w:hint="cs"/>
-          <w:rtl/>
-          <w:lang w:bidi="ar-EG"/>
-        </w:rPr>
-        <w:t xml:space="preserve"> اعلي الشاشة </w:t>
-      </w:r>
-      <w:r>
-        <w:rPr>
-          <w:rFonts w:cs="Arial"/>
-          <w:rtl/>
-        </w:rPr>
-        <w:t xml:space="preserve">  ... لضمان الوقوف علي فولد اللي انا عايزة</w:t>
-      </w:r>
-      <w:r>
-        <w:rPr>
-          <w:rFonts w:cs="Arial" w:hint="cs"/>
-          <w:rtl/>
+        <w:t>Concrete design</w:t>
+      </w:r>
+    </w:p>
+    <w:p>
+      <w:pPr>
+        <w:bidi/>
+        <w:rPr>
+          <w:b/>
+          <w:bCs/>
+          <w:color w:val="0070C0"/>
+          <w:sz w:val="28"/>
+          <w:szCs w:val="28"/>
+          <w:u w:val="single"/>
+          <w:rtl/>
+          <w:lang w:bidi="ar-EG"/>
+        </w:rPr>
+      </w:pPr>
+      <w:r>
+        <w:rPr>
+          <w:rFonts w:hint="cs"/>
+          <w:b/>
+          <w:bCs/>
+          <w:color w:val="0070C0"/>
+          <w:sz w:val="28"/>
+          <w:szCs w:val="28"/>
+          <w:u w:val="single"/>
+          <w:rtl/>
+          <w:lang w:bidi="ar-EG"/>
+        </w:rPr>
+        <w:t xml:space="preserve">تشغيل مشروع </w:t>
+      </w:r>
+      <w:r>
+        <w:rPr>
+          <w:b/>
+          <w:bCs/>
+          <w:color w:val="0070C0"/>
+          <w:sz w:val="28"/>
+          <w:szCs w:val="28"/>
+          <w:u w:val="single"/>
+          <w:lang w:bidi="ar-EG"/>
+        </w:rPr>
+        <w:t>Concrete design</w:t>
+      </w:r>
+      <w:r>
+        <w:rPr>
+          <w:rFonts w:hint="cs"/>
+          <w:b/>
+          <w:bCs/>
+          <w:color w:val="0070C0"/>
+          <w:sz w:val="28"/>
+          <w:szCs w:val="28"/>
+          <w:u w:val="single"/>
+          <w:rtl/>
+          <w:lang w:bidi="ar-EG"/>
         </w:rPr>
         <w:t xml:space="preserve"> </w:t>
       </w:r>
-      <w:r>
-        <w:t xml:space="preserve"> </w:t>
-      </w:r>
-      <w:r>
-        <w:t>Concrete design</w:t>
-      </w:r>
-    </w:p>
-    <w:p>
-      <w:pPr>
-        <w:bidi/>
-        <w:rPr>
-          <w:b/>
-          <w:bCs/>
-          <w:color w:val="0070C0"/>
-          <w:sz w:val="28"/>
-          <w:szCs w:val="28"/>
-          <w:u w:val="single"/>
-          <w:rtl/>
-          <w:lang w:bidi="ar-EG"/>
-        </w:rPr>
-      </w:pPr>
-      <w:r>
-        <w:rPr>
-          <w:rFonts w:hint="cs"/>
-          <w:b/>
-          <w:bCs/>
-          <w:color w:val="0070C0"/>
-          <w:sz w:val="28"/>
-          <w:szCs w:val="28"/>
-          <w:u w:val="single"/>
-          <w:rtl/>
-          <w:lang w:bidi="ar-EG"/>
-        </w:rPr>
-        <w:t xml:space="preserve">تشغيل مشروع </w:t>
-      </w:r>
-      <w:r>
-        <w:rPr>
-          <w:b/>
-          <w:bCs/>
-          <w:color w:val="0070C0"/>
-          <w:sz w:val="28"/>
-          <w:szCs w:val="28"/>
-          <w:u w:val="single"/>
-          <w:lang w:bidi="ar-EG"/>
-        </w:rPr>
-        <w:t>Concrete design</w:t>
-      </w:r>
-      <w:r>
-        <w:rPr>
-          <w:rFonts w:hint="cs"/>
-          <w:b/>
-          <w:bCs/>
-          <w:color w:val="0070C0"/>
-          <w:sz w:val="28"/>
-          <w:szCs w:val="28"/>
-          <w:u w:val="single"/>
-          <w:rtl/>
-          <w:lang w:bidi="ar-EG"/>
-        </w:rPr>
-        <w:t xml:space="preserve"> </w:t>
-      </w:r>
     </w:p>
     <w:p>
       <w:pPr>
@@ -281,7 +271,6 @@
         </w:rPr>
         <w:t xml:space="preserve">يختلف من مشروع الي مشروع ويحتاج نسال </w:t>
       </w:r>
-      <w:proofErr w:type="spellStart"/>
       <w:r>
         <w:rPr>
           <w:b/>
@@ -291,7 +280,6 @@
         </w:rPr>
         <w:t>AntiGravity</w:t>
       </w:r>
-      <w:proofErr w:type="spellEnd"/>
       <w:r>
         <w:rPr>
           <w:rFonts w:hint="cs"/>
@@ -359,29 +347,7 @@
           <w:szCs w:val="28"/>
           <w:highlight w:val="yellow"/>
         </w:rPr>
-        <w:t xml:space="preserve">python -m </w:t>
-      </w:r>
-      <w:proofErr w:type="spellStart"/>
-      <w:r>
-        <w:rPr>
-          <w:b/>
-          <w:bCs/>
-          <w:sz w:val="28"/>
-          <w:szCs w:val="28"/>
-          <w:highlight w:val="yellow"/>
-        </w:rPr>
-        <w:t>streamlit</w:t>
-      </w:r>
-      <w:proofErr w:type="spellEnd"/>
-      <w:r>
-        <w:rPr>
-          <w:b/>
-          <w:bCs/>
-          <w:sz w:val="28"/>
-          <w:szCs w:val="28"/>
-          <w:highlight w:val="yellow"/>
-        </w:rPr>
-        <w:t xml:space="preserve"> run app.py</w:t>
+        <w:t>python -m streamlit run app.py</w:t>
       </w:r>
     </w:p>
     <w:p>
@@ -598,9 +564,293 @@
     <w:p>
       <w:pPr>
         <w:bidi/>
-        <w:rPr>
-          <w:b/>
-          <w:bCs/>
+        <w:spacing w:after="0" w:line="240" w:lineRule="auto"/>
+        <w:rPr>
+          <w:b/>
+          <w:bCs/>
+          <w:sz w:val="28"/>
+          <w:szCs w:val="28"/>
+          <w:u w:val="single"/>
+          <w:rtl/>
+          <w:lang w:bidi="ar-EG"/>
+        </w:rPr>
+      </w:pPr>
+      <w:r>
+        <w:rPr>
+          <w:rFonts w:hint="cs"/>
+          <w:b/>
+          <w:bCs/>
+          <w:sz w:val="28"/>
+          <w:szCs w:val="28"/>
+          <w:u w:val="single"/>
+          <w:rtl/>
+          <w:lang w:bidi="ar-EG"/>
+        </w:rPr>
+        <w:t xml:space="preserve">اوامر التحديث </w:t>
+      </w:r>
+      <w:r>
+        <w:rPr>
+          <w:b/>
+          <w:bCs/>
+          <w:sz w:val="28"/>
+          <w:szCs w:val="28"/>
+          <w:u w:val="single"/>
+          <w:lang w:bidi="ar-EG"/>
+        </w:rPr>
+        <w:t xml:space="preserve">update </w:t>
+      </w:r>
+      <w:r>
+        <w:rPr>
+          <w:rFonts w:hint="cs"/>
+          <w:b/>
+          <w:bCs/>
+          <w:sz w:val="28"/>
+          <w:szCs w:val="28"/>
+          <w:u w:val="single"/>
+          <w:rtl/>
+          <w:lang w:bidi="ar-EG"/>
+        </w:rPr>
+        <w:t xml:space="preserve"> هي :-</w:t>
+      </w:r>
+    </w:p>
+    <w:p>
+      <w:pPr>
+        <w:spacing w:after="0" w:line="240" w:lineRule="auto"/>
+        <w:rPr>
+          <w:rFonts w:cs="Arial"/>
+          <w:b/>
+          <w:bCs/>
+          <w:color w:val="0070C0"/>
+          <w:sz w:val="28"/>
+          <w:szCs w:val="28"/>
+          <w:u w:val="single"/>
+          <w:lang w:bidi="ar-EG"/>
+        </w:rPr>
+      </w:pPr>
+      <w:r>
+        <w:rPr>
+          <w:b/>
+          <w:bCs/>
+          <w:color w:val="0070C0"/>
+          <w:sz w:val="28"/>
+          <w:szCs w:val="28"/>
+          <w:u w:val="single"/>
+          <w:lang w:bidi="ar-EG"/>
+        </w:rPr>
+        <w:t>git add</w:t>
+      </w:r>
+      <w:r>
+        <w:rPr>
+          <w:rFonts w:cs="Arial"/>
+          <w:b/>
+          <w:bCs/>
+          <w:color w:val="0070C0"/>
+          <w:sz w:val="28"/>
+          <w:szCs w:val="28"/>
+          <w:u w:val="single"/>
+          <w:rtl/>
+          <w:lang w:bidi="ar-EG"/>
+        </w:rPr>
+        <w:t xml:space="preserve"> .</w:t>
+      </w:r>
+    </w:p>
+    <w:p>
+      <w:pPr>
+        <w:bidi/>
+        <w:spacing w:after="0" w:line="240" w:lineRule="auto"/>
+        <w:rPr>
+          <w:rFonts w:cs="Arial" w:hint="cs"/>
+          <w:sz w:val="24"/>
+          <w:szCs w:val="24"/>
+          <w:rtl/>
+          <w:lang w:bidi="ar-EG"/>
+        </w:rPr>
+      </w:pPr>
+      <w:r>
+        <w:rPr>
+          <w:rFonts w:cs="Arial" w:hint="cs"/>
+          <w:sz w:val="24"/>
+          <w:szCs w:val="24"/>
+          <w:rtl/>
+          <w:lang w:bidi="ar-EG"/>
+        </w:rPr>
+        <w:t xml:space="preserve">يعطي عدة تحذيرات </w:t>
+      </w:r>
+      <w:r>
+        <w:rPr>
+          <w:rFonts w:cs="Arial"/>
+          <w:sz w:val="24"/>
+          <w:szCs w:val="24"/>
+          <w:lang w:bidi="ar-EG"/>
+        </w:rPr>
+        <w:t xml:space="preserve"> Warning </w:t>
+      </w:r>
+      <w:r>
+        <w:rPr>
+          <w:rFonts w:cs="Arial" w:hint="cs"/>
+          <w:sz w:val="24"/>
+          <w:szCs w:val="24"/>
+          <w:rtl/>
+          <w:lang w:bidi="ar-EG"/>
+        </w:rPr>
+        <w:t xml:space="preserve">بانه سيت استبدال الملفات في ال </w:t>
+      </w:r>
+      <w:r>
+        <w:rPr>
+          <w:rFonts w:cs="Arial"/>
+          <w:sz w:val="24"/>
+          <w:szCs w:val="24"/>
+          <w:lang w:bidi="ar-EG"/>
+        </w:rPr>
+        <w:t>Git Hub</w:t>
+      </w:r>
+      <w:r>
+        <w:rPr>
+          <w:rFonts w:cs="Arial" w:hint="cs"/>
+          <w:sz w:val="24"/>
+          <w:szCs w:val="24"/>
+          <w:rtl/>
+          <w:lang w:bidi="ar-EG"/>
+        </w:rPr>
+        <w:t xml:space="preserve"> بملفات جديدة</w:t>
+      </w:r>
+    </w:p>
+    <w:p>
+      <w:pPr>
+        <w:spacing w:after="0" w:line="240" w:lineRule="auto"/>
+        <w:rPr>
+          <w:b/>
+          <w:bCs/>
+          <w:color w:val="0070C0"/>
+          <w:sz w:val="28"/>
+          <w:szCs w:val="28"/>
+          <w:u w:val="single"/>
+          <w:rtl/>
+          <w:lang w:bidi="ar-EG"/>
+        </w:rPr>
+      </w:pPr>
+      <w:r>
+        <w:rPr>
+          <w:b/>
+          <w:bCs/>
+          <w:color w:val="0070C0"/>
+          <w:sz w:val="28"/>
+          <w:szCs w:val="28"/>
+          <w:u w:val="single"/>
+          <w:lang w:bidi="ar-EG"/>
+        </w:rPr>
+        <w:t>git commit -m "Added features"</w:t>
+      </w:r>
+    </w:p>
+    <w:p>
+      <w:pPr>
+        <w:bidi/>
+        <w:spacing w:after="0" w:line="240" w:lineRule="auto"/>
+        <w:rPr>
+          <w:rFonts w:cs="Arial"/>
+          <w:sz w:val="24"/>
+          <w:szCs w:val="24"/>
+          <w:lang w:bidi="ar-EG"/>
+        </w:rPr>
+      </w:pPr>
+      <w:r>
+        <w:rPr>
+          <w:rFonts w:cs="Arial" w:hint="cs"/>
+          <w:sz w:val="24"/>
+          <w:szCs w:val="24"/>
+          <w:rtl/>
+          <w:lang w:bidi="ar-EG"/>
+        </w:rPr>
+        <w:t xml:space="preserve">يعطي اخطارات عن </w:t>
+      </w:r>
+      <w:r>
+        <w:rPr>
+          <w:rFonts w:cs="Arial"/>
+          <w:sz w:val="24"/>
+          <w:szCs w:val="24"/>
+          <w:lang w:bidi="ar-EG"/>
+        </w:rPr>
+        <w:t>Create Modes</w:t>
+      </w:r>
+      <w:r>
+        <w:rPr>
+          <w:rFonts w:cs="Arial" w:hint="cs"/>
+          <w:sz w:val="24"/>
+          <w:szCs w:val="24"/>
+          <w:rtl/>
+          <w:lang w:bidi="ar-EG"/>
+        </w:rPr>
+        <w:t xml:space="preserve"> </w:t>
+      </w:r>
+      <w:r>
+        <w:rPr>
+          <w:rFonts w:cs="Arial"/>
+          <w:sz w:val="24"/>
+          <w:szCs w:val="24"/>
+          <w:lang w:bidi="ar-EG"/>
+        </w:rPr>
+        <w:t xml:space="preserve"> </w:t>
+      </w:r>
+    </w:p>
+    <w:p>
+      <w:pPr>
+        <w:spacing w:after="0" w:line="240" w:lineRule="auto"/>
+        <w:rPr>
+          <w:rFonts w:hint="cs"/>
+          <w:b/>
+          <w:bCs/>
+          <w:color w:val="0070C0"/>
+          <w:sz w:val="28"/>
+          <w:szCs w:val="28"/>
+          <w:u w:val="single"/>
+          <w:lang w:bidi="ar-EG"/>
+        </w:rPr>
+      </w:pPr>
+      <w:r>
+        <w:rPr>
+          <w:b/>
+          <w:bCs/>
+          <w:color w:val="0070C0"/>
+          <w:sz w:val="28"/>
+          <w:szCs w:val="28"/>
+          <w:u w:val="single"/>
+          <w:lang w:bidi="ar-EG"/>
+        </w:rPr>
+        <w:t>git push</w:t>
+      </w:r>
+    </w:p>
+    <w:p>
+      <w:pPr>
+        <w:bidi/>
+        <w:rPr>
+          <w:rFonts w:cs="Arial"/>
+          <w:sz w:val="24"/>
+          <w:szCs w:val="24"/>
+          <w:rtl/>
+          <w:lang w:bidi="ar-EG"/>
+        </w:rPr>
+      </w:pPr>
+      <w:r>
+        <w:rPr>
+          <w:rFonts w:cs="Arial" w:hint="cs"/>
+          <w:sz w:val="24"/>
+          <w:szCs w:val="24"/>
+          <w:rtl/>
+          <w:lang w:bidi="ar-EG"/>
+        </w:rPr>
+        <w:t>يقوم بالتنفيذ</w:t>
+      </w:r>
+    </w:p>
+    <w:p>
+      <w:pPr>
+        <w:bidi/>
+        <w:rPr>
+          <w:b/>
+          <w:bCs/>
+          <w:color w:val="0070C0"/>
+          <w:sz w:val="28"/>
+          <w:szCs w:val="28"/>
+          <w:u w:val="single"/>
           <w:rtl/>
           <w:lang w:bidi="ar-EG"/>
         </w:rPr>
@@ -612,15 +862,15 @@
         <mc:AlternateContent>
           <mc:Choice Requires="wps">
             <w:drawing>
-              <wp:anchor distT="0" distB="0" distL="114300" distR="114300" simplePos="0" relativeHeight="251663360" behindDoc="0" locked="0" layoutInCell="1" allowOverlap="1" wp14:anchorId="3F1326CF" wp14:editId="4B3C2154">
+              <wp:anchor distT="0" distB="0" distL="114300" distR="114300" simplePos="0" relativeHeight="251663360" behindDoc="0" locked="0" layoutInCell="1" allowOverlap="1" wp14:anchorId="3F1326CF" wp14:editId="3F68C6A2">
                 <wp:simplePos x="0" y="0"/>
                 <wp:positionH relativeFrom="column">
-                  <wp:posOffset>965744</wp:posOffset>
+                  <wp:posOffset>965200</wp:posOffset>
                 </wp:positionH>
                 <wp:positionV relativeFrom="paragraph">
-                  <wp:posOffset>1031059</wp:posOffset>
+                  <wp:posOffset>1023620</wp:posOffset>
                 </wp:positionV>
-                <wp:extent cx="1344386" cy="5443"/>
+                <wp:extent cx="1344295" cy="5080"/>
                 <wp:effectExtent l="19050" t="19050" r="8255" b="33020"/>
                 <wp:wrapNone/>
                 <wp:docPr id="4" name="Straight Connector 4"/>
@@ -632,7 +882,7 @@
                       <wps:spPr>
                         <a:xfrm flipH="1">
                           <a:off x="0" y="0"/>
-                          <a:ext cx="1344386" cy="5443"/>
+                          <a:ext cx="1344295" cy="5080"/>
                         </a:xfrm>
                         <a:prstGeom prst="line">
                           <a:avLst/>
@@ -666,7 +916,7 @@
           </mc:Choice>
           <mc:Fallback>
             <w:pict>
-              <v:line w14:anchorId="0F22A862" id="Straight Connector 4" o:spid="_x0000_s1026" style="position:absolute;flip:x;z-index:251663360;visibility:visible;mso-wrap-style:square;mso-wrap-distance-left:9pt;mso-wrap-distance-top:0;mso-wrap-distance-right:9pt;mso-wrap-distance-bottom:0;mso-position-horizontal:absolute;mso-position-horizontal-relative:text;mso-position-vertical:absolute;mso-position-vertical-relative:text" from="76.05pt,81.2pt" to="181.9pt,81.65pt" o:gfxdata="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" strokecolor="red" strokeweight="3pt">
+              <v:line w14:anchorId="634E005A" id="Straight Connector 4" o:spid="_x0000_s1026" style="position:absolute;flip:x;z-index:251663360;visibility:visible;mso-wrap-style:square;mso-wrap-distance-left:9pt;mso-wrap-distance-top:0;mso-wrap-distance-right:9pt;mso-wrap-distance-bottom:0;mso-position-horizontal:absolute;mso-position-horizontal-relative:text;mso-position-vertical:absolute;mso-position-vertical-relative:text" from="76pt,80.6pt" to="181.85pt,81pt" o:gfxdata="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" strokecolor="red" strokeweight="3pt">
                 <v:stroke joinstyle="miter"/>
               </v:line>
             </w:pict>
@@ -680,15 +930,15 @@
         <mc:AlternateContent>
           <mc:Choice Requires="wps">
             <w:drawing>
-              <wp:anchor distT="0" distB="0" distL="114300" distR="114300" simplePos="0" relativeHeight="251661312" behindDoc="0" locked="0" layoutInCell="1" allowOverlap="1" wp14:anchorId="725E12FF" wp14:editId="4327F180">
+              <wp:anchor distT="0" distB="0" distL="114300" distR="114300" simplePos="0" relativeHeight="251661312" behindDoc="0" locked="0" layoutInCell="1" allowOverlap="1" wp14:anchorId="725E12FF" wp14:editId="5A6DBFED">
                 <wp:simplePos x="0" y="0"/>
                 <wp:positionH relativeFrom="column">
-                  <wp:posOffset>24402</wp:posOffset>
+                  <wp:posOffset>24130</wp:posOffset>
                 </wp:positionH>
                 <wp:positionV relativeFrom="paragraph">
-                  <wp:posOffset>824230</wp:posOffset>
+                  <wp:posOffset>817245</wp:posOffset>
                 </wp:positionV>
-                <wp:extent cx="1344386" cy="5443"/>
+                <wp:extent cx="1344295" cy="5080"/>
                 <wp:effectExtent l="19050" t="19050" r="8255" b="33020"/>
                 <wp:wrapNone/>
                 <wp:docPr id="3" name="Straight Connector 3"/>
@@ -700,7 +950,7 @@
                       <wps:spPr>
                         <a:xfrm flipH="1">
                           <a:off x="0" y="0"/>
-                          <a:ext cx="1344386" cy="5443"/>
+                          <a:ext cx="1344295" cy="5080"/>
                         </a:xfrm>
                         <a:prstGeom prst="line">
                           <a:avLst/>
@@ -734,7 +984,7 @@
           </mc:Choice>
           <mc:Fallback>
             <w:pict>
-              <v:line w14:anchorId="2B5E21A6" id="Straight Connector 3" o:spid="_x0000_s1026" style="position:absolute;flip:x;z-index:251661312;visibility:visible;mso-wrap-style:square;mso-wrap-distance-left:9pt;mso-wrap-distance-top:0;mso-wrap-distance-right:9pt;mso-wrap-distance-bottom:0;mso-position-horizontal:absolute;mso-position-horizontal-relative:text;mso-position-vertical:absolute;mso-position-vertical-relative:text" from="1.9pt,64.9pt" to="107.75pt,65.35pt" o:gfxdata="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" strokecolor="red" strokeweight="3pt">
+              <v:line w14:anchorId="598D8565" id="Straight Connector 3" o:spid="_x0000_s1026" style="position:absolute;flip:x;z-index:251661312;visibility:visible;mso-wrap-style:square;mso-wrap-distance-left:9pt;mso-wrap-distance-top:0;mso-wrap-distance-right:9pt;mso-wrap-distance-bottom:0;mso-position-horizontal:absolute;mso-position-horizontal-relative:text;mso-position-vertical:absolute;mso-position-vertical-relative:text" from="1.9pt,64.35pt" to="107.75pt,64.75pt" o:gfxdata="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" strokecolor="red" strokeweight="3pt">
                 <v:stroke joinstyle="miter"/>
               </v:line>
             </w:pict>
@@ -748,13 +998,13 @@
         <mc:AlternateContent>
           <mc:Choice Requires="wps">
             <w:drawing>
-              <wp:anchor distT="0" distB="0" distL="114300" distR="114300" simplePos="0" relativeHeight="251659264" behindDoc="0" locked="0" layoutInCell="1" allowOverlap="1" wp14:anchorId="76DA556E" wp14:editId="501701DA">
+              <wp:anchor distT="0" distB="0" distL="114300" distR="114300" simplePos="0" relativeHeight="251659264" behindDoc="0" locked="0" layoutInCell="1" allowOverlap="1" wp14:anchorId="76DA556E" wp14:editId="13024DC2">
                 <wp:simplePos x="0" y="0"/>
                 <wp:positionH relativeFrom="column">
-                  <wp:posOffset>70757</wp:posOffset>
+                  <wp:posOffset>70485</wp:posOffset>
                 </wp:positionH>
                 <wp:positionV relativeFrom="paragraph">
-                  <wp:posOffset>1589133</wp:posOffset>
+                  <wp:posOffset>1582362</wp:posOffset>
                 </wp:positionV>
                 <wp:extent cx="1344386" cy="5443"/>
                 <wp:effectExtent l="19050" t="19050" r="8255" b="33020"/>
@@ -802,7 +1052,7 @@
           </mc:Choice>
           <mc:Fallback>
             <w:pict>
-              <v:line w14:anchorId="1118FA51" id="Straight Connector 2" o:spid="_x0000_s1026" style="position:absolute;flip:x;z-index:251659264;visibility:visible;mso-wrap-style:square;mso-wrap-distance-left:9pt;mso-wrap-distance-top:0;mso-wrap-distance-right:9pt;mso-wrap-distance-bottom:0;mso-position-horizontal:absolute;mso-position-horizontal-relative:text;mso-position-vertical:absolute;mso-position-vertical-relative:text" from="5.55pt,125.15pt" to="111.4pt,125.6pt" o:gfxdata="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" strokecolor="red" strokeweight="3pt">
+              <v:line w14:anchorId="22450190" id="Straight Connector 2" o:spid="_x0000_s1026" style="position:absolute;flip:x;z-index:251659264;visibility:visible;mso-wrap-style:square;mso-wrap-distance-left:9pt;mso-wrap-distance-top:0;mso-wrap-distance-right:9pt;mso-wrap-distance-bottom:0;mso-position-horizontal:absolute;mso-position-horizontal-relative:text;mso-position-vertical:absolute;mso-position-vertical-relative:text" from="5.55pt,124.6pt" to="111.4pt,125.05pt" o:gfxdata="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" strokecolor="red" strokeweight="3pt">
                 <v:stroke joinstyle="miter"/>
               </v:line>
             </w:pict>
@@ -814,7 +1064,7 @@
           <w:noProof/>
         </w:rPr>
         <w:drawing>
-          <wp:inline distT="0" distB="0" distL="0" distR="0" wp14:anchorId="5FB35EA7" wp14:editId="56EA4914">
+          <wp:inline distT="0" distB="0" distL="0" distR="0" wp14:anchorId="24F45228" wp14:editId="778F8813">
             <wp:extent cx="5943600" cy="3068955"/>
             <wp:effectExtent l="0" t="0" r="0" b="0"/>
             <wp:docPr id="1" name="Picture 1"/>
@@ -873,21 +1123,37 @@
           <w:sz w:val="28"/>
           <w:szCs w:val="28"/>
           <w:u w:val="single"/>
-          <w:lang w:bidi="ar-EG"/>
-        </w:rPr>
-      </w:pPr>
-      <w:r>
-        <w:rPr>
-          <w:rFonts w:hint="cs"/>
-          <w:b/>
-          <w:bCs/>
-          <w:color w:val="0070C0"/>
-          <w:sz w:val="28"/>
-          <w:szCs w:val="28"/>
-          <w:u w:val="single"/>
-          <w:rtl/>
-          <w:lang w:bidi="ar-EG"/>
-        </w:rPr>
+          <w:rtl/>
+          <w:lang w:bidi="ar-EG"/>
+        </w:rPr>
+      </w:pPr>
+    </w:p>
+    <w:p>
+      <w:pPr>
+        <w:bidi/>
+        <w:rPr>
+          <w:b/>
+          <w:bCs/>
+          <w:color w:val="0070C0"/>
+          <w:sz w:val="28"/>
+          <w:szCs w:val="28"/>
+          <w:u w:val="single"/>
+          <w:lang w:bidi="ar-EG"/>
+        </w:rPr>
+      </w:pPr>
+      <w:r>
+        <w:rPr>
+          <w:rFonts w:hint="cs"/>
+          <w:b/>
+          <w:bCs/>
+          <w:color w:val="0070C0"/>
+          <w:sz w:val="28"/>
+          <w:szCs w:val="28"/>
+          <w:u w:val="single"/>
+          <w:rtl/>
+          <w:lang w:bidi="ar-EG"/>
+        </w:rPr>
+        <w:lastRenderedPageBreak/>
         <w:t>لينك</w:t>
       </w:r>
       <w:r>
@@ -1101,7 +1367,6 @@
         <w:jc w:val="right"/>
       </w:pPr>
       <w:r>
-        <w:lastRenderedPageBreak/>
         <w:t>hzayed3030@hotmail</w:t>
       </w:r>
     </w:p>
@@ -1111,13 +1376,15 @@
         <w:jc w:val="right"/>
       </w:pPr>
       <w:r>
-        <w:t>PWNgDGYxf6Tni7</w:t>
-      </w:r>
-      <w:proofErr w:type="gramStart"/>
-      <w:r>
-        <w:t>cDBTnCmJh!Q</w:t>
-      </w:r>
-      <w:proofErr w:type="gramEnd"/>
+        <w:rPr>
+          <w:rFonts w:hint="cs"/>
+          <w:rtl/>
+        </w:rPr>
+        <w:t xml:space="preserve">تم تغييره كما في </w:t>
+      </w:r>
+      <w:r>
+        <w:t>1 pass</w:t>
+      </w:r>
     </w:p>
     <w:p>
       <w:pPr>
@@ -1151,13 +1418,8 @@
         <w:bidi/>
         <w:jc w:val="right"/>
       </w:pPr>
-      <w:proofErr w:type="spellStart"/>
-      <w:r>
-        <w:t>QQQqqq</w:t>
-      </w:r>
-      <w:proofErr w:type="spellEnd"/>
-      <w:r>
-        <w:t>@@4600</w:t>
+      <w:r>
+        <w:t>QQQqqq@@4600</w:t>
       </w:r>
     </w:p>
     <w:p>
@@ -1174,13 +1436,8 @@
         <w:bidi/>
         <w:jc w:val="right"/>
       </w:pPr>
-      <w:proofErr w:type="spellStart"/>
-      <w:r>
-        <w:t>QQQqqq</w:t>
-      </w:r>
-      <w:proofErr w:type="spellEnd"/>
-      <w:r>
-        <w:t>@@88 - Mobile 01223976846</w:t>
+      <w:r>
+        <w:t>QQQqqq@@88 - Mobile 01223976846</w:t>
       </w:r>
     </w:p>
     <w:p>
@@ -1200,13 +1457,8 @@
           <w:rtl/>
         </w:rPr>
       </w:pPr>
-      <w:proofErr w:type="spellStart"/>
-      <w:r>
-        <w:t>QQQqqq</w:t>
-      </w:r>
-      <w:proofErr w:type="spellEnd"/>
-      <w:r>
-        <w:t>@@88 - Mobile 01020232244</w:t>
+      <w:r>
+        <w:t>QQQqqq@@88 - Mobile 01020232244</w:t>
       </w:r>
     </w:p>
     <w:p>

</xml_diff>

<commit_message>
Update project files excluding build artifacts
</commit_message>
<xml_diff>
--- a/التعامل مع مشاريع AntiGravity.docx
+++ b/التعامل مع مشاريع AntiGravity.docx
@@ -30,6 +30,7 @@
         </w:rPr>
         <w:t xml:space="preserve">التعامل مع مشاريع </w:t>
       </w:r>
+      <w:proofErr w:type="spellStart"/>
       <w:r>
         <w:rPr>
           <w:b/>
@@ -42,21 +43,34 @@
         </w:rPr>
         <w:t>AntiGravity</w:t>
       </w:r>
-    </w:p>
-    <w:p>
-      <w:pPr>
-        <w:bidi/>
-        <w:rPr>
-          <w:b/>
-          <w:bCs/>
-          <w:color w:val="0070C0"/>
-          <w:sz w:val="28"/>
-          <w:szCs w:val="28"/>
-          <w:u w:val="single"/>
-          <w:rtl/>
-          <w:lang w:bidi="ar-EG"/>
-        </w:rPr>
-      </w:pPr>
+      <w:proofErr w:type="spellEnd"/>
+    </w:p>
+    <w:p>
+      <w:pPr>
+        <w:bidi/>
+        <w:rPr>
+          <w:b/>
+          <w:bCs/>
+          <w:color w:val="0070C0"/>
+          <w:sz w:val="28"/>
+          <w:szCs w:val="28"/>
+          <w:u w:val="single"/>
+          <w:rtl/>
+          <w:lang w:bidi="ar-EG"/>
+        </w:rPr>
+      </w:pPr>
+      <w:r>
+        <w:rPr>
+          <w:b/>
+          <w:bCs/>
+          <w:color w:val="0070C0"/>
+          <w:sz w:val="28"/>
+          <w:szCs w:val="28"/>
+          <w:u w:val="single"/>
+          <w:lang w:bidi="ar-EG"/>
+        </w:rPr>
+        <w:t xml:space="preserve"> </w:t>
+      </w:r>
       <w:r>
         <w:rPr>
           <w:rFonts w:hint="cs"/>
@@ -150,7 +164,15 @@
         <w:t xml:space="preserve"> ثم نكتب</w:t>
       </w:r>
       <w:r>
-        <w:t xml:space="preserve"> cmd </w:t>
+        <w:t xml:space="preserve"> </w:t>
+      </w:r>
+      <w:proofErr w:type="spellStart"/>
+      <w:r>
+        <w:t>cmd</w:t>
+      </w:r>
+      <w:proofErr w:type="spellEnd"/>
+      <w:r>
+        <w:t xml:space="preserve"> </w:t>
       </w:r>
       <w:r>
         <w:rPr>
@@ -271,6 +293,7 @@
         </w:rPr>
         <w:t xml:space="preserve">يختلف من مشروع الي مشروع ويحتاج نسال </w:t>
       </w:r>
+      <w:proofErr w:type="spellStart"/>
       <w:r>
         <w:rPr>
           <w:b/>
@@ -280,6 +303,7 @@
         </w:rPr>
         <w:t>AntiGravity</w:t>
       </w:r>
+      <w:proofErr w:type="spellEnd"/>
       <w:r>
         <w:rPr>
           <w:rFonts w:hint="cs"/>
@@ -347,7 +371,29 @@
           <w:szCs w:val="28"/>
           <w:highlight w:val="yellow"/>
         </w:rPr>
-        <w:t>python -m streamlit run app.py</w:t>
+        <w:t xml:space="preserve">python -m </w:t>
+      </w:r>
+      <w:proofErr w:type="spellStart"/>
+      <w:r>
+        <w:rPr>
+          <w:b/>
+          <w:bCs/>
+          <w:sz w:val="28"/>
+          <w:szCs w:val="28"/>
+          <w:highlight w:val="yellow"/>
+        </w:rPr>
+        <w:t>streamlit</w:t>
+      </w:r>
+      <w:proofErr w:type="spellEnd"/>
+      <w:r>
+        <w:rPr>
+          <w:b/>
+          <w:bCs/>
+          <w:sz w:val="28"/>
+          <w:szCs w:val="28"/>
+          <w:highlight w:val="yellow"/>
+        </w:rPr>
+        <w:t xml:space="preserve"> run app.py</w:t>
       </w:r>
     </w:p>
     <w:p>
@@ -637,7 +683,20 @@
           <w:u w:val="single"/>
           <w:lang w:bidi="ar-EG"/>
         </w:rPr>
-        <w:t>git add</w:t>
+        <w:t xml:space="preserve">git </w:t>
+      </w:r>
+      <w:proofErr w:type="gramStart"/>
+      <w:r>
+        <w:rPr>
+          <w:b/>
+          <w:bCs/>
+          <w:color w:val="0070C0"/>
+          <w:sz w:val="28"/>
+          <w:szCs w:val="28"/>
+          <w:u w:val="single"/>
+          <w:lang w:bidi="ar-EG"/>
+        </w:rPr>
+        <w:t>add</w:t>
       </w:r>
       <w:r>
         <w:rPr>
@@ -653,19 +712,39 @@
         </w:rPr>
         <w:t xml:space="preserve"> .</w:t>
       </w:r>
+      <w:proofErr w:type="gramEnd"/>
     </w:p>
     <w:p>
       <w:pPr>
         <w:bidi/>
         <w:spacing w:after="0" w:line="240" w:lineRule="auto"/>
         <w:rPr>
+          <w:rFonts w:cs="Arial"/>
+          <w:sz w:val="24"/>
+          <w:szCs w:val="24"/>
+          <w:rtl/>
+          <w:lang w:bidi="ar-EG"/>
+        </w:rPr>
+      </w:pPr>
+      <w:r>
+        <w:rPr>
           <w:rFonts w:cs="Arial" w:hint="cs"/>
           <w:sz w:val="24"/>
           <w:szCs w:val="24"/>
           <w:rtl/>
           <w:lang w:bidi="ar-EG"/>
         </w:rPr>
-      </w:pPr>
+        <w:t xml:space="preserve">يعطي عدة تحذيرات </w:t>
+      </w:r>
+      <w:r>
+        <w:rPr>
+          <w:rFonts w:cs="Arial"/>
+          <w:sz w:val="24"/>
+          <w:szCs w:val="24"/>
+          <w:lang w:bidi="ar-EG"/>
+        </w:rPr>
+        <w:t xml:space="preserve"> Warning </w:t>
+      </w:r>
       <w:r>
         <w:rPr>
           <w:rFonts w:cs="Arial" w:hint="cs"/>
@@ -674,7 +753,7 @@
           <w:rtl/>
           <w:lang w:bidi="ar-EG"/>
         </w:rPr>
-        <w:t xml:space="preserve">يعطي عدة تحذيرات </w:t>
+        <w:t xml:space="preserve">بانه سيت استبدال الملفات في ال </w:t>
       </w:r>
       <w:r>
         <w:rPr>
@@ -683,7 +762,7 @@
           <w:szCs w:val="24"/>
           <w:lang w:bidi="ar-EG"/>
         </w:rPr>
-        <w:t xml:space="preserve"> Warning </w:t>
+        <w:t>Git Hub</w:t>
       </w:r>
       <w:r>
         <w:rPr>
@@ -693,17 +772,47 @@
           <w:rtl/>
           <w:lang w:bidi="ar-EG"/>
         </w:rPr>
-        <w:t xml:space="preserve">بانه سيت استبدال الملفات في ال </w:t>
-      </w:r>
-      <w:r>
+        <w:t xml:space="preserve"> بملفات جديدة</w:t>
+      </w:r>
+    </w:p>
+    <w:p>
+      <w:pPr>
+        <w:spacing w:after="0" w:line="240" w:lineRule="auto"/>
+        <w:rPr>
+          <w:b/>
+          <w:bCs/>
+          <w:color w:val="0070C0"/>
+          <w:sz w:val="28"/>
+          <w:szCs w:val="28"/>
+          <w:u w:val="single"/>
+          <w:rtl/>
+          <w:lang w:bidi="ar-EG"/>
+        </w:rPr>
+      </w:pPr>
+      <w:r>
+        <w:rPr>
+          <w:b/>
+          <w:bCs/>
+          <w:color w:val="0070C0"/>
+          <w:sz w:val="28"/>
+          <w:szCs w:val="28"/>
+          <w:u w:val="single"/>
+          <w:lang w:bidi="ar-EG"/>
+        </w:rPr>
+        <w:t>git commit -m "Added features"</w:t>
+      </w:r>
+    </w:p>
+    <w:p>
+      <w:pPr>
+        <w:bidi/>
+        <w:spacing w:after="0" w:line="240" w:lineRule="auto"/>
         <w:rPr>
           <w:rFonts w:cs="Arial"/>
           <w:sz w:val="24"/>
           <w:szCs w:val="24"/>
           <w:lang w:bidi="ar-EG"/>
         </w:rPr>
-        <w:t>Git Hub</w:t>
-      </w:r>
+      </w:pPr>
       <w:r>
         <w:rPr>
           <w:rFonts w:cs="Arial" w:hint="cs"/>
@@ -712,91 +821,41 @@
           <w:rtl/>
           <w:lang w:bidi="ar-EG"/>
         </w:rPr>
-        <w:t xml:space="preserve"> بملفات جديدة</w:t>
+        <w:t xml:space="preserve">يعطي اخطارات عن </w:t>
+      </w:r>
+      <w:r>
+        <w:rPr>
+          <w:rFonts w:cs="Arial"/>
+          <w:sz w:val="24"/>
+          <w:szCs w:val="24"/>
+          <w:lang w:bidi="ar-EG"/>
+        </w:rPr>
+        <w:t>Create Modes</w:t>
+      </w:r>
+      <w:r>
+        <w:rPr>
+          <w:rFonts w:cs="Arial" w:hint="cs"/>
+          <w:sz w:val="24"/>
+          <w:szCs w:val="24"/>
+          <w:rtl/>
+          <w:lang w:bidi="ar-EG"/>
+        </w:rPr>
+        <w:t xml:space="preserve"> </w:t>
+      </w:r>
+      <w:r>
+        <w:rPr>
+          <w:rFonts w:cs="Arial"/>
+          <w:sz w:val="24"/>
+          <w:szCs w:val="24"/>
+          <w:lang w:bidi="ar-EG"/>
+        </w:rPr>
+        <w:t xml:space="preserve"> </w:t>
       </w:r>
     </w:p>
     <w:p>
       <w:pPr>
         <w:spacing w:after="0" w:line="240" w:lineRule="auto"/>
         <w:rPr>
-          <w:b/>
-          <w:bCs/>
-          <w:color w:val="0070C0"/>
-          <w:sz w:val="28"/>
-          <w:szCs w:val="28"/>
-          <w:u w:val="single"/>
-          <w:rtl/>
-          <w:lang w:bidi="ar-EG"/>
-        </w:rPr>
-      </w:pPr>
-      <w:r>
-        <w:rPr>
-          <w:b/>
-          <w:bCs/>
-          <w:color w:val="0070C0"/>
-          <w:sz w:val="28"/>
-          <w:szCs w:val="28"/>
-          <w:u w:val="single"/>
-          <w:lang w:bidi="ar-EG"/>
-        </w:rPr>
-        <w:t>git commit -m "Added features"</w:t>
-      </w:r>
-    </w:p>
-    <w:p>
-      <w:pPr>
-        <w:bidi/>
-        <w:spacing w:after="0" w:line="240" w:lineRule="auto"/>
-        <w:rPr>
-          <w:rFonts w:cs="Arial"/>
-          <w:sz w:val="24"/>
-          <w:szCs w:val="24"/>
-          <w:lang w:bidi="ar-EG"/>
-        </w:rPr>
-      </w:pPr>
-      <w:r>
-        <w:rPr>
-          <w:rFonts w:cs="Arial" w:hint="cs"/>
-          <w:sz w:val="24"/>
-          <w:szCs w:val="24"/>
-          <w:rtl/>
-          <w:lang w:bidi="ar-EG"/>
-        </w:rPr>
-        <w:t xml:space="preserve">يعطي اخطارات عن </w:t>
-      </w:r>
-      <w:r>
-        <w:rPr>
-          <w:rFonts w:cs="Arial"/>
-          <w:sz w:val="24"/>
-          <w:szCs w:val="24"/>
-          <w:lang w:bidi="ar-EG"/>
-        </w:rPr>
-        <w:t>Create Modes</w:t>
-      </w:r>
-      <w:r>
-        <w:rPr>
-          <w:rFonts w:cs="Arial" w:hint="cs"/>
-          <w:sz w:val="24"/>
-          <w:szCs w:val="24"/>
-          <w:rtl/>
-          <w:lang w:bidi="ar-EG"/>
-        </w:rPr>
-        <w:t xml:space="preserve"> </w:t>
-      </w:r>
-      <w:r>
-        <w:rPr>
-          <w:rFonts w:cs="Arial"/>
-          <w:sz w:val="24"/>
-          <w:szCs w:val="24"/>
-          <w:lang w:bidi="ar-EG"/>
-        </w:rPr>
-        <w:t xml:space="preserve"> </w:t>
-      </w:r>
-    </w:p>
-    <w:p>
-      <w:pPr>
-        <w:spacing w:after="0" w:line="240" w:lineRule="auto"/>
-        <w:rPr>
-          <w:rFonts w:hint="cs"/>
           <w:b/>
           <w:bCs/>
           <w:color w:val="0070C0"/>
@@ -1263,7 +1322,6 @@
           <w:bCs/>
           <w:sz w:val="24"/>
           <w:szCs w:val="24"/>
-          <w:rtl/>
           <w:lang w:bidi="ar-EG"/>
         </w:rPr>
       </w:pPr>
@@ -1326,6 +1384,299 @@
     </w:p>
     <w:p>
       <w:pPr>
+        <w:rPr>
+          <w:b/>
+          <w:bCs/>
+          <w:sz w:val="24"/>
+          <w:szCs w:val="24"/>
+          <w:lang w:bidi="ar-EG"/>
+        </w:rPr>
+      </w:pPr>
+    </w:p>
+    <w:p>
+      <w:pPr>
+        <w:jc w:val="center"/>
+        <w:rPr>
+          <w:b/>
+          <w:bCs/>
+          <w:sz w:val="32"/>
+          <w:szCs w:val="32"/>
+          <w:u w:val="single"/>
+          <w:lang w:bidi="ar-EG"/>
+        </w:rPr>
+      </w:pPr>
+      <w:r>
+        <w:rPr>
+          <w:b/>
+          <w:bCs/>
+          <w:sz w:val="32"/>
+          <w:szCs w:val="32"/>
+          <w:highlight w:val="yellow"/>
+          <w:u w:val="single"/>
+          <w:lang w:bidi="ar-EG"/>
+        </w:rPr>
+        <w:t>AUTOHOTKEYS</w:t>
+      </w:r>
+    </w:p>
+    <w:p>
+      <w:pPr>
+        <w:rPr>
+          <w:b/>
+          <w:bCs/>
+          <w:sz w:val="24"/>
+          <w:szCs w:val="24"/>
+          <w:lang w:bidi="ar-EG"/>
+        </w:rPr>
+      </w:pPr>
+      <w:r>
+        <w:rPr>
+          <w:b/>
+          <w:bCs/>
+          <w:sz w:val="24"/>
+          <w:szCs w:val="24"/>
+          <w:lang w:bidi="ar-EG"/>
+        </w:rPr>
+        <w:t xml:space="preserve">Ctrl </w:t>
+      </w:r>
+      <w:r>
+        <w:rPr>
+          <w:b/>
+          <w:bCs/>
+          <w:sz w:val="24"/>
+          <w:szCs w:val="24"/>
+          <w:lang w:bidi="ar-EG"/>
+        </w:rPr>
+        <w:t xml:space="preserve">       </w:t>
+      </w:r>
+      <w:r>
+        <w:rPr>
+          <w:b/>
+          <w:bCs/>
+          <w:sz w:val="24"/>
+          <w:szCs w:val="24"/>
+          <w:lang w:bidi="ar-EG"/>
+        </w:rPr>
+        <w:t xml:space="preserve">^    </w:t>
+      </w:r>
+    </w:p>
+    <w:p>
+      <w:pPr>
+        <w:rPr>
+          <w:b/>
+          <w:bCs/>
+          <w:sz w:val="24"/>
+          <w:szCs w:val="24"/>
+          <w:lang w:bidi="ar-EG"/>
+        </w:rPr>
+      </w:pPr>
+      <w:r>
+        <w:rPr>
+          <w:b/>
+          <w:bCs/>
+          <w:sz w:val="24"/>
+          <w:szCs w:val="24"/>
+          <w:lang w:bidi="ar-EG"/>
+        </w:rPr>
+        <w:t>Alt</w:t>
+      </w:r>
+      <w:r>
+        <w:rPr>
+          <w:b/>
+          <w:bCs/>
+          <w:sz w:val="24"/>
+          <w:szCs w:val="24"/>
+          <w:lang w:bidi="ar-EG"/>
+        </w:rPr>
+        <w:t xml:space="preserve">      </w:t>
+      </w:r>
+      <w:proofErr w:type="gramStart"/>
+      <w:r>
+        <w:rPr>
+          <w:b/>
+          <w:bCs/>
+          <w:sz w:val="24"/>
+          <w:szCs w:val="24"/>
+          <w:lang w:bidi="ar-EG"/>
+        </w:rPr>
+        <w:t xml:space="preserve">   </w:t>
+      </w:r>
+      <w:r>
+        <w:rPr>
+          <w:b/>
+          <w:bCs/>
+          <w:sz w:val="24"/>
+          <w:szCs w:val="24"/>
+          <w:lang w:bidi="ar-EG"/>
+        </w:rPr>
+        <w:t>(</w:t>
+      </w:r>
+      <w:proofErr w:type="gramEnd"/>
+      <w:r>
+        <w:rPr>
+          <w:b/>
+          <w:bCs/>
+          <w:sz w:val="24"/>
+          <w:szCs w:val="24"/>
+          <w:lang w:bidi="ar-EG"/>
+        </w:rPr>
+        <w:t xml:space="preserve"> </w:t>
+      </w:r>
+      <w:r>
+        <w:rPr>
+          <w:b/>
+          <w:bCs/>
+          <w:sz w:val="24"/>
+          <w:szCs w:val="24"/>
+          <w:lang w:bidi="ar-EG"/>
+        </w:rPr>
+        <w:t>!</w:t>
+      </w:r>
+      <w:r>
+        <w:rPr>
+          <w:b/>
+          <w:bCs/>
+          <w:sz w:val="24"/>
+          <w:szCs w:val="24"/>
+          <w:lang w:bidi="ar-EG"/>
+        </w:rPr>
+        <w:t>)</w:t>
+      </w:r>
+    </w:p>
+    <w:p>
+      <w:pPr>
+        <w:rPr>
+          <w:rFonts w:hint="cs"/>
+          <w:b/>
+          <w:bCs/>
+          <w:sz w:val="24"/>
+          <w:szCs w:val="24"/>
+          <w:rtl/>
+          <w:lang w:bidi="ar-EG"/>
+        </w:rPr>
+      </w:pPr>
+      <w:r>
+        <w:rPr>
+          <w:b/>
+          <w:bCs/>
+          <w:sz w:val="24"/>
+          <w:szCs w:val="24"/>
+          <w:lang w:bidi="ar-EG"/>
+        </w:rPr>
+        <w:t xml:space="preserve">Shift </w:t>
+      </w:r>
+      <w:r>
+        <w:rPr>
+          <w:b/>
+          <w:bCs/>
+          <w:sz w:val="24"/>
+          <w:szCs w:val="24"/>
+          <w:lang w:bidi="ar-EG"/>
+        </w:rPr>
+        <w:t xml:space="preserve">  </w:t>
+      </w:r>
+      <w:proofErr w:type="gramStart"/>
+      <w:r>
+        <w:rPr>
+          <w:b/>
+          <w:bCs/>
+          <w:sz w:val="24"/>
+          <w:szCs w:val="24"/>
+          <w:lang w:bidi="ar-EG"/>
+        </w:rPr>
+        <w:t xml:space="preserve">   </w:t>
+      </w:r>
+      <w:r>
+        <w:rPr>
+          <w:b/>
+          <w:bCs/>
+          <w:sz w:val="24"/>
+          <w:szCs w:val="24"/>
+          <w:lang w:bidi="ar-EG"/>
+        </w:rPr>
+        <w:t>(</w:t>
+      </w:r>
+      <w:proofErr w:type="gramEnd"/>
+      <w:r>
+        <w:rPr>
+          <w:b/>
+          <w:bCs/>
+          <w:sz w:val="24"/>
+          <w:szCs w:val="24"/>
+          <w:lang w:bidi="ar-EG"/>
+        </w:rPr>
+        <w:t>+)</w:t>
+      </w:r>
+      <w:r>
+        <w:rPr>
+          <w:b/>
+          <w:bCs/>
+          <w:sz w:val="24"/>
+          <w:szCs w:val="24"/>
+          <w:lang w:bidi="ar-EG"/>
+        </w:rPr>
+        <w:br/>
+      </w:r>
+      <w:r>
+        <w:rPr>
+          <w:b/>
+          <w:bCs/>
+          <w:sz w:val="24"/>
+          <w:szCs w:val="24"/>
+          <w:lang w:bidi="ar-EG"/>
+        </w:rPr>
+        <w:t>Win</w:t>
+      </w:r>
+      <w:r>
+        <w:rPr>
+          <w:b/>
+          <w:bCs/>
+          <w:sz w:val="24"/>
+          <w:szCs w:val="24"/>
+          <w:lang w:bidi="ar-EG"/>
+        </w:rPr>
+        <w:t xml:space="preserve">      (#)</w:t>
+      </w:r>
+    </w:p>
+    <w:p>
+      <w:pPr>
+        <w:rPr>
+          <w:b/>
+          <w:bCs/>
+          <w:sz w:val="24"/>
+          <w:szCs w:val="24"/>
+          <w:rtl/>
+          <w:lang w:bidi="ar-EG"/>
+        </w:rPr>
+      </w:pPr>
+    </w:p>
+    <w:p>
+      <w:pPr>
+        <w:bidi/>
+        <w:rPr>
+          <w:b/>
+          <w:bCs/>
+          <w:sz w:val="24"/>
+          <w:szCs w:val="24"/>
+          <w:rtl/>
+          <w:lang w:bidi="ar-EG"/>
+        </w:rPr>
+      </w:pPr>
+    </w:p>
+    <w:p>
+      <w:pPr>
+        <w:bidi/>
+        <w:rPr>
+          <w:b/>
+          <w:bCs/>
+          <w:sz w:val="24"/>
+          <w:szCs w:val="24"/>
+          <w:rtl/>
+          <w:lang w:bidi="ar-EG"/>
+        </w:rPr>
+      </w:pPr>
+    </w:p>
+    <w:p>
+      <w:pPr>
         <w:bidi/>
         <w:rPr>
           <w:b/>
@@ -1418,8 +1769,13 @@
         <w:bidi/>
         <w:jc w:val="right"/>
       </w:pPr>
-      <w:r>
-        <w:t>QQQqqq@@4600</w:t>
+      <w:proofErr w:type="spellStart"/>
+      <w:r>
+        <w:t>QQQqqq</w:t>
+      </w:r>
+      <w:proofErr w:type="spellEnd"/>
+      <w:r>
+        <w:t>@@4600</w:t>
       </w:r>
     </w:p>
     <w:p>
@@ -1436,8 +1792,13 @@
         <w:bidi/>
         <w:jc w:val="right"/>
       </w:pPr>
-      <w:r>
-        <w:t>QQQqqq@@88 - Mobile 01223976846</w:t>
+      <w:proofErr w:type="spellStart"/>
+      <w:r>
+        <w:t>QQQqqq</w:t>
+      </w:r>
+      <w:proofErr w:type="spellEnd"/>
+      <w:r>
+        <w:t>@@88 - Mobile 01223976846</w:t>
       </w:r>
     </w:p>
     <w:p>
@@ -1457,8 +1818,13 @@
           <w:rtl/>
         </w:rPr>
       </w:pPr>
-      <w:r>
-        <w:t>QQQqqq@@88 - Mobile 01020232244</w:t>
+      <w:proofErr w:type="spellStart"/>
+      <w:r>
+        <w:t>QQQqqq</w:t>
+      </w:r>
+      <w:proofErr w:type="spellEnd"/>
+      <w:r>
+        <w:t>@@88 - Mobile 01020232244</w:t>
       </w:r>
     </w:p>
     <w:p>

</xml_diff>

<commit_message>
Change model to project
</commit_message>
<xml_diff>
--- a/التعامل مع مشاريع AntiGravity.docx
+++ b/التعامل مع مشاريع AntiGravity.docx
@@ -334,16 +334,27 @@
       <w:r>
         <w:rPr>
           <w:rFonts w:hint="cs"/>
+          <w:b/>
+          <w:bCs/>
+          <w:u w:val="single"/>
           <w:rtl/>
         </w:rPr>
         <w:t xml:space="preserve">علي جهازي </w:t>
       </w:r>
       <w:r>
+        <w:rPr>
+          <w:b/>
+          <w:bCs/>
+          <w:u w:val="single"/>
+        </w:rPr>
         <w:t>Local host</w:t>
       </w:r>
       <w:r>
         <w:rPr>
           <w:rFonts w:hint="cs"/>
+          <w:b/>
+          <w:bCs/>
+          <w:u w:val="single"/>
           <w:rtl/>
           <w:lang w:bidi="ar-EG"/>
         </w:rPr>
@@ -351,6 +362,9 @@
       </w:r>
       <w:r>
         <w:rPr>
+          <w:b/>
+          <w:bCs/>
+          <w:u w:val="single"/>
           <w:lang w:bidi="ar-EG"/>
         </w:rPr>
         <w:t>CMD</w:t>
@@ -1446,17 +1460,7 @@
           <w:szCs w:val="24"/>
           <w:lang w:bidi="ar-EG"/>
         </w:rPr>
-        <w:t xml:space="preserve">       </w:t>
-      </w:r>
-      <w:r>
-        <w:rPr>
-          <w:b/>
-          <w:bCs/>
-          <w:sz w:val="24"/>
-          <w:szCs w:val="24"/>
-          <w:lang w:bidi="ar-EG"/>
-        </w:rPr>
-        <w:t xml:space="preserve">^    </w:t>
+        <w:t xml:space="preserve">       ^    </w:t>
       </w:r>
     </w:p>
     <w:p>
@@ -1545,7 +1549,6 @@
     <w:p>
       <w:pPr>
         <w:rPr>
-          <w:rFonts w:hint="cs"/>
           <w:b/>
           <w:bCs/>
           <w:sz w:val="24"/>

</xml_diff>

<commit_message>
Edit deflection & punching
</commit_message>
<xml_diff>
--- a/التعامل مع مشاريع AntiGravity.docx
+++ b/التعامل مع مشاريع AntiGravity.docx
@@ -30,7 +30,6 @@
         </w:rPr>
         <w:t xml:space="preserve">التعامل مع مشاريع </w:t>
       </w:r>
-      <w:proofErr w:type="spellStart"/>
       <w:r>
         <w:rPr>
           <w:b/>
@@ -43,7 +42,6 @@
         </w:rPr>
         <w:t>AntiGravity</w:t>
       </w:r>
-      <w:proofErr w:type="spellEnd"/>
     </w:p>
     <w:p>
       <w:pPr>
@@ -164,112 +162,104 @@
         <w:t xml:space="preserve"> ثم نكتب</w:t>
       </w:r>
       <w:r>
+        <w:t xml:space="preserve"> cmd </w:t>
+      </w:r>
+      <w:r>
+        <w:rPr>
+          <w:rFonts w:cs="Arial"/>
+          <w:rtl/>
+        </w:rPr>
+        <w:t xml:space="preserve">من سطر الاكسبلورو مكان </w:t>
+      </w:r>
+      <w:r>
+        <w:rPr>
+          <w:rFonts w:cs="Arial"/>
+        </w:rPr>
+        <w:t xml:space="preserve">Address </w:t>
+      </w:r>
+      <w:r>
+        <w:rPr>
+          <w:rFonts w:cs="Arial" w:hint="cs"/>
+          <w:rtl/>
+          <w:lang w:bidi="ar-EG"/>
+        </w:rPr>
+        <w:t xml:space="preserve"> اعلي الشاشة </w:t>
+      </w:r>
+      <w:r>
+        <w:rPr>
+          <w:rFonts w:cs="Arial"/>
+          <w:rtl/>
+        </w:rPr>
+        <w:t xml:space="preserve">  ... لضمان الوقوف علي فولد اللي انا عايزة</w:t>
+      </w:r>
+      <w:r>
+        <w:rPr>
+          <w:rFonts w:cs="Arial" w:hint="cs"/>
+          <w:rtl/>
+        </w:rPr>
         <w:t xml:space="preserve"> </w:t>
       </w:r>
-      <w:proofErr w:type="spellStart"/>
-      <w:r>
-        <w:t>cmd</w:t>
-      </w:r>
-      <w:proofErr w:type="spellEnd"/>
       <w:r>
         <w:t xml:space="preserve"> </w:t>
       </w:r>
       <w:r>
-        <w:rPr>
-          <w:rFonts w:cs="Arial"/>
-          <w:rtl/>
-        </w:rPr>
-        <w:t xml:space="preserve">من سطر الاكسبلورو مكان </w:t>
-      </w:r>
-      <w:r>
-        <w:rPr>
-          <w:rFonts w:cs="Arial"/>
-        </w:rPr>
-        <w:t xml:space="preserve">Address </w:t>
-      </w:r>
-      <w:r>
-        <w:rPr>
-          <w:rFonts w:cs="Arial" w:hint="cs"/>
-          <w:rtl/>
-          <w:lang w:bidi="ar-EG"/>
-        </w:rPr>
-        <w:t xml:space="preserve"> اعلي الشاشة </w:t>
-      </w:r>
-      <w:r>
-        <w:rPr>
-          <w:rFonts w:cs="Arial"/>
-          <w:rtl/>
-        </w:rPr>
-        <w:t xml:space="preserve">  ... لضمان الوقوف علي فولد اللي انا عايزة</w:t>
-      </w:r>
-      <w:r>
-        <w:rPr>
-          <w:rFonts w:cs="Arial" w:hint="cs"/>
-          <w:rtl/>
+        <w:t>Concrete design</w:t>
+      </w:r>
+    </w:p>
+    <w:p>
+      <w:pPr>
+        <w:bidi/>
+        <w:rPr>
+          <w:b/>
+          <w:bCs/>
+          <w:color w:val="0070C0"/>
+          <w:sz w:val="28"/>
+          <w:szCs w:val="28"/>
+          <w:u w:val="single"/>
+          <w:rtl/>
+          <w:lang w:bidi="ar-EG"/>
+        </w:rPr>
+      </w:pPr>
+      <w:r>
+        <w:rPr>
+          <w:rFonts w:hint="cs"/>
+          <w:b/>
+          <w:bCs/>
+          <w:color w:val="0070C0"/>
+          <w:sz w:val="28"/>
+          <w:szCs w:val="28"/>
+          <w:u w:val="single"/>
+          <w:rtl/>
+          <w:lang w:bidi="ar-EG"/>
+        </w:rPr>
+        <w:t xml:space="preserve">تشغيل مشروع </w:t>
+      </w:r>
+      <w:r>
+        <w:rPr>
+          <w:b/>
+          <w:bCs/>
+          <w:color w:val="0070C0"/>
+          <w:sz w:val="28"/>
+          <w:szCs w:val="28"/>
+          <w:u w:val="single"/>
+          <w:lang w:bidi="ar-EG"/>
+        </w:rPr>
+        <w:t>Concrete design</w:t>
+      </w:r>
+      <w:r>
+        <w:rPr>
+          <w:rFonts w:hint="cs"/>
+          <w:b/>
+          <w:bCs/>
+          <w:color w:val="0070C0"/>
+          <w:sz w:val="28"/>
+          <w:szCs w:val="28"/>
+          <w:u w:val="single"/>
+          <w:rtl/>
+          <w:lang w:bidi="ar-EG"/>
         </w:rPr>
         <w:t xml:space="preserve"> </w:t>
       </w:r>
-      <w:r>
-        <w:t xml:space="preserve"> </w:t>
-      </w:r>
-      <w:r>
-        <w:t>Concrete design</w:t>
-      </w:r>
-    </w:p>
-    <w:p>
-      <w:pPr>
-        <w:bidi/>
-        <w:rPr>
-          <w:b/>
-          <w:bCs/>
-          <w:color w:val="0070C0"/>
-          <w:sz w:val="28"/>
-          <w:szCs w:val="28"/>
-          <w:u w:val="single"/>
-          <w:rtl/>
-          <w:lang w:bidi="ar-EG"/>
-        </w:rPr>
-      </w:pPr>
-      <w:r>
-        <w:rPr>
-          <w:rFonts w:hint="cs"/>
-          <w:b/>
-          <w:bCs/>
-          <w:color w:val="0070C0"/>
-          <w:sz w:val="28"/>
-          <w:szCs w:val="28"/>
-          <w:u w:val="single"/>
-          <w:rtl/>
-          <w:lang w:bidi="ar-EG"/>
-        </w:rPr>
-        <w:t xml:space="preserve">تشغيل مشروع </w:t>
-      </w:r>
-      <w:r>
-        <w:rPr>
-          <w:b/>
-          <w:bCs/>
-          <w:color w:val="0070C0"/>
-          <w:sz w:val="28"/>
-          <w:szCs w:val="28"/>
-          <w:u w:val="single"/>
-          <w:lang w:bidi="ar-EG"/>
-        </w:rPr>
-        <w:t>Concrete design</w:t>
-      </w:r>
-      <w:r>
-        <w:rPr>
-          <w:rFonts w:hint="cs"/>
-          <w:b/>
-          <w:bCs/>
-          <w:color w:val="0070C0"/>
-          <w:sz w:val="28"/>
-          <w:szCs w:val="28"/>
-          <w:u w:val="single"/>
-          <w:rtl/>
-          <w:lang w:bidi="ar-EG"/>
-        </w:rPr>
-        <w:t xml:space="preserve"> </w:t>
-      </w:r>
     </w:p>
     <w:p>
       <w:pPr>
@@ -293,7 +283,6 @@
         </w:rPr>
         <w:t xml:space="preserve">يختلف من مشروع الي مشروع ويحتاج نسال </w:t>
       </w:r>
-      <w:proofErr w:type="spellStart"/>
       <w:r>
         <w:rPr>
           <w:b/>
@@ -303,7 +292,6 @@
         </w:rPr>
         <w:t>AntiGravity</w:t>
       </w:r>
-      <w:proofErr w:type="spellEnd"/>
       <w:r>
         <w:rPr>
           <w:rFonts w:hint="cs"/>
@@ -385,29 +373,7 @@
           <w:szCs w:val="28"/>
           <w:highlight w:val="yellow"/>
         </w:rPr>
-        <w:t xml:space="preserve">python -m </w:t>
-      </w:r>
-      <w:proofErr w:type="spellStart"/>
-      <w:r>
-        <w:rPr>
-          <w:b/>
-          <w:bCs/>
-          <w:sz w:val="28"/>
-          <w:szCs w:val="28"/>
-          <w:highlight w:val="yellow"/>
-        </w:rPr>
-        <w:t>streamlit</w:t>
-      </w:r>
-      <w:proofErr w:type="spellEnd"/>
-      <w:r>
-        <w:rPr>
-          <w:b/>
-          <w:bCs/>
-          <w:sz w:val="28"/>
-          <w:szCs w:val="28"/>
-          <w:highlight w:val="yellow"/>
-        </w:rPr>
-        <w:t xml:space="preserve"> run app.py</w:t>
+        <w:t>python -m streamlit run app.py</w:t>
       </w:r>
     </w:p>
     <w:p>
@@ -697,20 +663,7 @@
           <w:u w:val="single"/>
           <w:lang w:bidi="ar-EG"/>
         </w:rPr>
-        <w:t xml:space="preserve">git </w:t>
-      </w:r>
-      <w:proofErr w:type="gramStart"/>
-      <w:r>
-        <w:rPr>
-          <w:b/>
-          <w:bCs/>
-          <w:color w:val="0070C0"/>
-          <w:sz w:val="28"/>
-          <w:szCs w:val="28"/>
-          <w:u w:val="single"/>
-          <w:lang w:bidi="ar-EG"/>
-        </w:rPr>
-        <w:t>add</w:t>
+        <w:t>git add</w:t>
       </w:r>
       <w:r>
         <w:rPr>
@@ -726,7 +679,6 @@
         </w:rPr>
         <w:t xml:space="preserve"> .</w:t>
       </w:r>
-      <w:proofErr w:type="gramEnd"/>
     </w:p>
     <w:p>
       <w:pPr>
@@ -1491,349 +1443,1147 @@
           <w:szCs w:val="24"/>
           <w:lang w:bidi="ar-EG"/>
         </w:rPr>
-        <w:t xml:space="preserve">      </w:t>
-      </w:r>
-      <w:proofErr w:type="gramStart"/>
-      <w:r>
-        <w:rPr>
-          <w:b/>
-          <w:bCs/>
-          <w:sz w:val="24"/>
-          <w:szCs w:val="24"/>
-          <w:lang w:bidi="ar-EG"/>
-        </w:rPr>
-        <w:t xml:space="preserve">   </w:t>
-      </w:r>
-      <w:r>
-        <w:rPr>
-          <w:b/>
-          <w:bCs/>
-          <w:sz w:val="24"/>
-          <w:szCs w:val="24"/>
-          <w:lang w:bidi="ar-EG"/>
-        </w:rPr>
-        <w:t>(</w:t>
-      </w:r>
-      <w:proofErr w:type="gramEnd"/>
-      <w:r>
-        <w:rPr>
-          <w:b/>
-          <w:bCs/>
-          <w:sz w:val="24"/>
-          <w:szCs w:val="24"/>
+        <w:t xml:space="preserve">         </w:t>
+      </w:r>
+      <w:r>
+        <w:rPr>
+          <w:b/>
+          <w:bCs/>
+          <w:sz w:val="24"/>
+          <w:szCs w:val="24"/>
+          <w:lang w:bidi="ar-EG"/>
+        </w:rPr>
+        <w:t xml:space="preserve">( </w:t>
+      </w:r>
+      <w:r>
+        <w:rPr>
+          <w:b/>
+          <w:bCs/>
+          <w:sz w:val="24"/>
+          <w:szCs w:val="24"/>
+          <w:lang w:bidi="ar-EG"/>
+        </w:rPr>
+        <w:t>!</w:t>
+      </w:r>
+      <w:r>
+        <w:rPr>
+          <w:b/>
+          <w:bCs/>
+          <w:sz w:val="24"/>
+          <w:szCs w:val="24"/>
+          <w:lang w:bidi="ar-EG"/>
+        </w:rPr>
+        <w:t>)</w:t>
+      </w:r>
+    </w:p>
+    <w:p>
+      <w:pPr>
+        <w:rPr>
+          <w:b/>
+          <w:bCs/>
+          <w:sz w:val="24"/>
+          <w:szCs w:val="24"/>
+          <w:rtl/>
+          <w:lang w:bidi="ar-EG"/>
+        </w:rPr>
+      </w:pPr>
+      <w:r>
+        <w:rPr>
+          <w:b/>
+          <w:bCs/>
+          <w:sz w:val="24"/>
+          <w:szCs w:val="24"/>
+          <w:lang w:bidi="ar-EG"/>
+        </w:rPr>
+        <w:t xml:space="preserve">Shift </w:t>
+      </w:r>
+      <w:r>
+        <w:rPr>
+          <w:b/>
+          <w:bCs/>
+          <w:sz w:val="24"/>
+          <w:szCs w:val="24"/>
+          <w:lang w:bidi="ar-EG"/>
+        </w:rPr>
+        <w:t xml:space="preserve">     </w:t>
+      </w:r>
+      <w:r>
+        <w:rPr>
+          <w:b/>
+          <w:bCs/>
+          <w:sz w:val="24"/>
+          <w:szCs w:val="24"/>
+          <w:lang w:bidi="ar-EG"/>
+        </w:rPr>
+        <w:t>(+)</w:t>
+      </w:r>
+      <w:r>
+        <w:rPr>
+          <w:b/>
+          <w:bCs/>
+          <w:sz w:val="24"/>
+          <w:szCs w:val="24"/>
+          <w:lang w:bidi="ar-EG"/>
+        </w:rPr>
+        <w:br/>
+      </w:r>
+      <w:r>
+        <w:rPr>
+          <w:b/>
+          <w:bCs/>
+          <w:sz w:val="24"/>
+          <w:szCs w:val="24"/>
+          <w:lang w:bidi="ar-EG"/>
+        </w:rPr>
+        <w:t>Win</w:t>
+      </w:r>
+      <w:r>
+        <w:rPr>
+          <w:b/>
+          <w:bCs/>
+          <w:sz w:val="24"/>
+          <w:szCs w:val="24"/>
+          <w:lang w:bidi="ar-EG"/>
+        </w:rPr>
+        <w:t xml:space="preserve">      (#)</w:t>
+      </w:r>
+    </w:p>
+    <w:p>
+      <w:pPr>
+        <w:rPr>
+          <w:b/>
+          <w:bCs/>
+          <w:sz w:val="24"/>
+          <w:szCs w:val="24"/>
+          <w:rtl/>
+          <w:lang w:bidi="ar-EG"/>
+        </w:rPr>
+      </w:pPr>
+    </w:p>
+    <w:p>
+      <w:pPr>
+        <w:bidi/>
+        <w:rPr>
+          <w:b/>
+          <w:bCs/>
+          <w:sz w:val="24"/>
+          <w:szCs w:val="24"/>
+          <w:rtl/>
+          <w:lang w:bidi="ar-EG"/>
+        </w:rPr>
+      </w:pPr>
+    </w:p>
+    <w:p>
+      <w:pPr>
+        <w:bidi/>
+        <w:rPr>
+          <w:b/>
+          <w:bCs/>
+          <w:sz w:val="24"/>
+          <w:szCs w:val="24"/>
+          <w:rtl/>
+          <w:lang w:bidi="ar-EG"/>
+        </w:rPr>
+      </w:pPr>
+    </w:p>
+    <w:p>
+      <w:pPr>
+        <w:bidi/>
+        <w:rPr>
+          <w:b/>
+          <w:bCs/>
+          <w:sz w:val="24"/>
+          <w:szCs w:val="24"/>
+          <w:rtl/>
+          <w:lang w:bidi="ar-EG"/>
+        </w:rPr>
+      </w:pPr>
+    </w:p>
+    <w:p>
+      <w:pPr>
+        <w:bidi/>
+        <w:rPr>
+          <w:b/>
+          <w:bCs/>
+          <w:sz w:val="28"/>
+          <w:szCs w:val="28"/>
+          <w:u w:val="single"/>
+        </w:rPr>
+      </w:pPr>
+      <w:r>
+        <w:rPr>
+          <w:rFonts w:hint="cs"/>
+          <w:b/>
+          <w:bCs/>
+          <w:sz w:val="28"/>
+          <w:szCs w:val="28"/>
+          <w:u w:val="single"/>
+          <w:rtl/>
+        </w:rPr>
+        <w:t>ايميلات للاستخدام كوتا اضافية</w:t>
+      </w:r>
+    </w:p>
+    <w:p>
+      <w:pPr>
+        <w:bidi/>
+        <w:jc w:val="right"/>
+      </w:pPr>
+      <w:r>
+        <w:t>hzayed3030@hotmail</w:t>
+      </w:r>
+    </w:p>
+    <w:p>
+      <w:pPr>
+        <w:bidi/>
+        <w:jc w:val="right"/>
+      </w:pPr>
+      <w:r>
+        <w:rPr>
+          <w:rFonts w:hint="cs"/>
+          <w:rtl/>
+        </w:rPr>
+        <w:t xml:space="preserve">تم تغييره كما في </w:t>
+      </w:r>
+      <w:r>
+        <w:t>1 pass</w:t>
+      </w:r>
+    </w:p>
+    <w:p>
+      <w:pPr>
+        <w:bidi/>
+        <w:jc w:val="right"/>
+      </w:pPr>
+      <w:r>
+        <w:t>hzayed1010@gmail</w:t>
+      </w:r>
+    </w:p>
+    <w:p>
+      <w:pPr>
+        <w:bidi/>
+        <w:jc w:val="right"/>
+      </w:pPr>
+      <w:r>
+        <w:t>6boFT*YffZeqEiQV6hBP</w:t>
+      </w:r>
+    </w:p>
+    <w:p>
+      <w:pPr>
+        <w:bidi/>
+        <w:jc w:val="right"/>
+      </w:pPr>
+      <w:r>
+        <w:t>hzayed4600@gmail.com</w:t>
+      </w:r>
+    </w:p>
+    <w:p>
+      <w:pPr>
+        <w:bidi/>
+        <w:jc w:val="right"/>
+      </w:pPr>
+      <w:r>
+        <w:t>QQQqqq@@4600</w:t>
+      </w:r>
+    </w:p>
+    <w:p>
+      <w:pPr>
+        <w:bidi/>
+        <w:jc w:val="right"/>
+      </w:pPr>
+      <w:r>
+        <w:t>hbody2005@gmail.com</w:t>
+      </w:r>
+    </w:p>
+    <w:p>
+      <w:pPr>
+        <w:bidi/>
+        <w:jc w:val="right"/>
+      </w:pPr>
+      <w:r>
+        <w:t>QQQqqq@@88 - Mobile 01223976846</w:t>
+      </w:r>
+    </w:p>
+    <w:p>
+      <w:pPr>
+        <w:bidi/>
+        <w:jc w:val="right"/>
+      </w:pPr>
+      <w:r>
+        <w:t>hmabmohamed1994</w:t>
+      </w:r>
+    </w:p>
+    <w:p>
+      <w:pPr>
+        <w:bidi/>
+        <w:jc w:val="right"/>
+        <w:rPr>
+          <w:rtl/>
+        </w:rPr>
+      </w:pPr>
+      <w:r>
+        <w:t>QQQqqq@@88 - Mobile 01020232244</w:t>
+      </w:r>
+    </w:p>
+    <w:p>
+      <w:pPr>
+        <w:bidi/>
+        <w:jc w:val="right"/>
+        <w:rPr>
+          <w:rtl/>
+        </w:rPr>
+      </w:pPr>
+    </w:p>
+    <w:p>
+      <w:pPr>
+        <w:bidi/>
+        <w:jc w:val="center"/>
+        <w:rPr>
+          <w:b/>
+          <w:bCs/>
+          <w:color w:val="FF0000"/>
+          <w:sz w:val="44"/>
+          <w:szCs w:val="44"/>
+          <w:u w:val="single"/>
+          <w:rtl/>
+          <w:lang w:bidi="ar-EG"/>
+        </w:rPr>
+      </w:pPr>
+      <w:r>
+        <w:rPr>
+          <w:rFonts w:hint="cs"/>
+          <w:b/>
+          <w:bCs/>
+          <w:color w:val="FF0000"/>
+          <w:sz w:val="32"/>
+          <w:szCs w:val="32"/>
+          <w:highlight w:val="yellow"/>
+          <w:u w:val="single"/>
+          <w:rtl/>
+        </w:rPr>
+        <w:t xml:space="preserve">خطوات انشاء مشروع علي </w:t>
+      </w:r>
+      <w:r>
+        <w:rPr>
+          <w:b/>
+          <w:bCs/>
+          <w:color w:val="FF0000"/>
+          <w:sz w:val="32"/>
+          <w:szCs w:val="32"/>
+          <w:highlight w:val="yellow"/>
+          <w:u w:val="single"/>
+        </w:rPr>
+        <w:t>Git Hub</w:t>
+      </w:r>
+      <w:r>
+        <w:rPr>
+          <w:rFonts w:hint="cs"/>
+          <w:b/>
+          <w:bCs/>
+          <w:color w:val="FF0000"/>
+          <w:sz w:val="32"/>
+          <w:szCs w:val="32"/>
+          <w:highlight w:val="yellow"/>
+          <w:u w:val="single"/>
+          <w:rtl/>
+          <w:lang w:bidi="ar-EG"/>
+        </w:rPr>
+        <w:t xml:space="preserve"> ورفع</w:t>
+      </w:r>
+      <w:r>
+        <w:rPr>
+          <w:rFonts w:hint="cs"/>
+          <w:b/>
+          <w:bCs/>
+          <w:color w:val="FF0000"/>
+          <w:sz w:val="32"/>
+          <w:szCs w:val="32"/>
+          <w:highlight w:val="yellow"/>
+          <w:u w:val="single"/>
+          <w:rtl/>
+          <w:lang w:bidi="ar-EG"/>
+        </w:rPr>
+        <w:t>ه</w:t>
+      </w:r>
+      <w:r>
+        <w:rPr>
+          <w:rFonts w:hint="cs"/>
+          <w:b/>
+          <w:bCs/>
+          <w:color w:val="FF0000"/>
+          <w:sz w:val="32"/>
+          <w:szCs w:val="32"/>
+          <w:highlight w:val="yellow"/>
+          <w:u w:val="single"/>
+          <w:rtl/>
+          <w:lang w:bidi="ar-EG"/>
+        </w:rPr>
+        <w:t xml:space="preserve"> علي هذه المنصة</w:t>
+      </w:r>
+    </w:p>
+    <w:p>
+      <w:pPr>
+        <w:bidi/>
+        <w:jc w:val="right"/>
+        <w:rPr>
+          <w:rFonts w:hint="cs"/>
+          <w:rtl/>
+          <w:lang w:bidi="ar-EG"/>
+        </w:rPr>
+      </w:pPr>
+    </w:p>
+    <w:p>
+      <w:pPr>
+        <w:bidi/>
+        <w:rPr>
+          <w:lang w:bidi="ar-EG"/>
+        </w:rPr>
+      </w:pPr>
+      <w:r>
+        <w:rPr>
+          <w:rFonts w:hint="cs"/>
+          <w:rtl/>
+          <w:lang w:bidi="ar-EG"/>
+        </w:rPr>
+        <w:t xml:space="preserve">قبل الشغل في المشرو من الاول </w:t>
+      </w:r>
+      <w:r>
+        <w:rPr>
+          <w:rtl/>
+          <w:lang w:bidi="ar-EG"/>
+        </w:rPr>
+        <w:br/>
+      </w:r>
+      <w:r>
+        <w:rPr>
+          <w:rFonts w:hint="cs"/>
+          <w:rtl/>
+          <w:lang w:bidi="ar-EG"/>
+        </w:rPr>
+        <w:t xml:space="preserve">انشاء </w:t>
+      </w:r>
+      <w:r>
+        <w:rPr>
+          <w:lang w:bidi="ar-EG"/>
+        </w:rPr>
+        <w:t xml:space="preserve">New </w:t>
+      </w:r>
+      <w:r>
+        <w:rPr>
+          <w:lang w:bidi="ar-EG"/>
+        </w:rPr>
+        <w:t>Repositories</w:t>
+      </w:r>
+      <w:r>
+        <w:rPr>
           <w:lang w:bidi="ar-EG"/>
         </w:rPr>
         <w:t xml:space="preserve"> </w:t>
       </w:r>
       <w:r>
         <w:rPr>
-          <w:b/>
-          <w:bCs/>
-          <w:sz w:val="24"/>
-          <w:szCs w:val="24"/>
-          <w:lang w:bidi="ar-EG"/>
-        </w:rPr>
-        <w:t>!</w:t>
-      </w:r>
-      <w:r>
-        <w:rPr>
-          <w:b/>
-          <w:bCs/>
-          <w:sz w:val="24"/>
-          <w:szCs w:val="24"/>
-          <w:lang w:bidi="ar-EG"/>
-        </w:rPr>
-        <w:t>)</w:t>
-      </w:r>
-    </w:p>
-    <w:p>
-      <w:pPr>
-        <w:rPr>
-          <w:b/>
-          <w:bCs/>
-          <w:sz w:val="24"/>
-          <w:szCs w:val="24"/>
-          <w:rtl/>
-          <w:lang w:bidi="ar-EG"/>
-        </w:rPr>
-      </w:pPr>
-      <w:r>
-        <w:rPr>
-          <w:b/>
-          <w:bCs/>
-          <w:sz w:val="24"/>
-          <w:szCs w:val="24"/>
-          <w:lang w:bidi="ar-EG"/>
-        </w:rPr>
-        <w:t xml:space="preserve">Shift </w:t>
-      </w:r>
-      <w:r>
-        <w:rPr>
-          <w:b/>
-          <w:bCs/>
-          <w:sz w:val="24"/>
-          <w:szCs w:val="24"/>
-          <w:lang w:bidi="ar-EG"/>
-        </w:rPr>
-        <w:t xml:space="preserve">  </w:t>
-      </w:r>
-      <w:proofErr w:type="gramStart"/>
-      <w:r>
-        <w:rPr>
-          <w:b/>
-          <w:bCs/>
-          <w:sz w:val="24"/>
-          <w:szCs w:val="24"/>
-          <w:lang w:bidi="ar-EG"/>
-        </w:rPr>
-        <w:t xml:space="preserve">   </w:t>
-      </w:r>
-      <w:r>
-        <w:rPr>
-          <w:b/>
-          <w:bCs/>
-          <w:sz w:val="24"/>
-          <w:szCs w:val="24"/>
-          <w:lang w:bidi="ar-EG"/>
-        </w:rPr>
-        <w:t>(</w:t>
-      </w:r>
-      <w:proofErr w:type="gramEnd"/>
-      <w:r>
-        <w:rPr>
-          <w:b/>
-          <w:bCs/>
-          <w:sz w:val="24"/>
-          <w:szCs w:val="24"/>
-          <w:lang w:bidi="ar-EG"/>
-        </w:rPr>
-        <w:t>+)</w:t>
-      </w:r>
-      <w:r>
-        <w:rPr>
-          <w:b/>
-          <w:bCs/>
-          <w:sz w:val="24"/>
-          <w:szCs w:val="24"/>
+          <w:rFonts w:hint="cs"/>
+          <w:rtl/>
+          <w:lang w:bidi="ar-EG"/>
+        </w:rPr>
+        <w:t xml:space="preserve"> من </w:t>
+      </w:r>
+      <w:r>
+        <w:rPr>
+          <w:lang w:bidi="ar-EG"/>
+        </w:rPr>
+        <w:t>Git hub</w:t>
+      </w:r>
+      <w:r>
+        <w:rPr>
+          <w:rFonts w:hint="cs"/>
+          <w:rtl/>
+          <w:lang w:bidi="ar-EG"/>
+        </w:rPr>
+        <w:t xml:space="preserve"> باسم </w:t>
+      </w:r>
+      <w:r>
+        <w:rPr>
+          <w:lang w:bidi="ar-EG"/>
+        </w:rPr>
+        <w:t>testing</w:t>
+      </w:r>
+    </w:p>
+    <w:p>
+      <w:pPr>
+        <w:rPr>
+          <w:lang w:bidi="ar-EG"/>
+        </w:rPr>
+      </w:pPr>
+      <w:r>
+        <w:rPr>
+          <w:rFonts w:ascii="Segoe UI" w:hAnsi="Segoe UI" w:cs="Segoe UI"/>
+          <w:b/>
+          <w:bCs/>
+          <w:color w:val="1F2328"/>
+          <w:sz w:val="21"/>
+          <w:szCs w:val="21"/>
+          <w:shd w:val="clear" w:color="auto" w:fill="FFFFFF"/>
+        </w:rPr>
+        <w:t>Repository name</w:t>
+      </w:r>
+      <w:r>
+        <w:rPr>
+          <w:rFonts w:ascii="Segoe UI" w:hAnsi="Segoe UI" w:cs="Segoe UI"/>
+          <w:b/>
+          <w:bCs/>
+          <w:color w:val="1F2328"/>
+          <w:sz w:val="21"/>
+          <w:szCs w:val="21"/>
+          <w:shd w:val="clear" w:color="auto" w:fill="FFFFFF"/>
+        </w:rPr>
+        <w:t xml:space="preserve"> : </w:t>
+      </w:r>
+      <w:r>
+        <w:rPr>
+          <w:lang w:bidi="ar-EG"/>
+        </w:rPr>
+        <w:t>testing</w:t>
+      </w:r>
+    </w:p>
+    <w:p>
+      <w:pPr>
+        <w:rPr>
+          <w:lang w:bidi="ar-EG"/>
+        </w:rPr>
+      </w:pPr>
+      <w:r>
+        <w:rPr>
+          <w:lang w:bidi="ar-EG"/>
+        </w:rPr>
+        <w:lastRenderedPageBreak/>
+        <w:t>Then CREATE enter</w:t>
+      </w:r>
+    </w:p>
+    <w:p>
+      <w:pPr>
+        <w:bidi/>
+        <w:rPr>
+          <w:rtl/>
+          <w:lang w:bidi="ar-EG"/>
+        </w:rPr>
+      </w:pPr>
+      <w:r>
+        <w:rPr>
+          <w:rFonts w:hint="cs"/>
+          <w:rtl/>
+          <w:lang w:bidi="ar-EG"/>
+        </w:rPr>
+        <w:t xml:space="preserve">تظهر شاشة اسمها </w:t>
+      </w:r>
+      <w:r>
+        <w:rPr>
+          <w:lang w:bidi="ar-EG"/>
+        </w:rPr>
+        <w:t>Quick Set up</w:t>
+      </w:r>
+      <w:r>
+        <w:rPr>
+          <w:rFonts w:hint="cs"/>
+          <w:rtl/>
+          <w:lang w:bidi="ar-EG"/>
+        </w:rPr>
+        <w:t xml:space="preserve"> بها اللينك</w:t>
+      </w:r>
+    </w:p>
+    <w:p>
+      <w:pPr>
+        <w:bidi/>
+        <w:rPr>
+          <w:rtl/>
+          <w:lang w:bidi="ar-EG"/>
+        </w:rPr>
+      </w:pPr>
+      <w:r>
+        <w:rPr>
+          <w:rFonts w:hint="cs"/>
+          <w:rtl/>
+          <w:lang w:bidi="ar-EG"/>
+        </w:rPr>
+        <w:t xml:space="preserve">او يمكن ناخد اللينك (ينتج من الضغط علي الزر الاخضر </w:t>
+      </w:r>
+      <w:r>
+        <w:rPr>
+          <w:lang w:bidi="ar-EG"/>
+        </w:rPr>
+        <w:t xml:space="preserve">Code </w:t>
+      </w:r>
+      <w:r>
+        <w:rPr>
+          <w:rFonts w:hint="cs"/>
+          <w:rtl/>
+          <w:lang w:bidi="ar-EG"/>
+        </w:rPr>
+        <w:t xml:space="preserve"> (الاسم سيختلف من مشروع لاخر)</w:t>
+      </w:r>
+    </w:p>
+    <w:p>
+      <w:pPr>
+        <w:bidi/>
+        <w:rPr>
+          <w:lang w:bidi="ar-EG"/>
+        </w:rPr>
+      </w:pPr>
+      <w:hyperlink r:id="rId7" w:history="1">
+        <w:r>
+          <w:rPr>
+            <w:rStyle w:val="Hyperlink"/>
+            <w:lang w:bidi="ar-EG"/>
+          </w:rPr>
+          <w:t>https://github.com/hzayed3030-cell/testing.git</w:t>
+        </w:r>
+      </w:hyperlink>
+    </w:p>
+    <w:p>
+      <w:pPr>
+        <w:bidi/>
+        <w:rPr>
+          <w:rtl/>
+          <w:lang w:bidi="ar-EG"/>
+        </w:rPr>
+      </w:pPr>
+      <w:r>
+        <w:rPr>
+          <w:rFonts w:hint="cs"/>
+          <w:rtl/>
+          <w:lang w:bidi="ar-EG"/>
+        </w:rPr>
+        <w:t xml:space="preserve">نقف علي ال </w:t>
+      </w:r>
+      <w:r>
+        <w:rPr>
+          <w:lang w:bidi="ar-EG"/>
+        </w:rPr>
+        <w:t>F</w:t>
+      </w:r>
+      <w:r>
+        <w:rPr>
+          <w:rFonts w:hint="cs"/>
+          <w:rtl/>
+          <w:lang w:bidi="ar-EG"/>
+        </w:rPr>
+        <w:t xml:space="preserve"> في الهارد الذي سيتم انشاء الفولدر </w:t>
+      </w:r>
+      <w:r>
+        <w:rPr>
+          <w:lang w:bidi="ar-EG"/>
+        </w:rPr>
+        <w:t>testing</w:t>
+      </w:r>
+      <w:r>
+        <w:rPr>
+          <w:rFonts w:hint="cs"/>
+          <w:rtl/>
+          <w:lang w:bidi="ar-EG"/>
+        </w:rPr>
+        <w:t xml:space="preserve"> عليه</w:t>
+      </w:r>
+    </w:p>
+    <w:p>
+      <w:pPr>
+        <w:bidi/>
+        <w:rPr>
+          <w:rtl/>
+          <w:lang w:bidi="ar-EG"/>
+        </w:rPr>
+      </w:pPr>
+      <w:r>
+        <w:rPr>
+          <w:rFonts w:hint="cs"/>
+          <w:rtl/>
+          <w:lang w:bidi="ar-EG"/>
+        </w:rPr>
+        <w:t xml:space="preserve">ثم نكتب </w:t>
+      </w:r>
+      <w:r>
+        <w:rPr>
+          <w:lang w:bidi="ar-EG"/>
+        </w:rPr>
+        <w:t>CMD</w:t>
+      </w:r>
+      <w:r>
+        <w:rPr>
           <w:lang w:bidi="ar-EG"/>
         </w:rPr>
         <w:br/>
       </w:r>
       <w:r>
         <w:rPr>
-          <w:b/>
-          <w:bCs/>
-          <w:sz w:val="24"/>
-          <w:szCs w:val="24"/>
-          <w:lang w:bidi="ar-EG"/>
-        </w:rPr>
-        <w:t>Win</w:t>
-      </w:r>
-      <w:r>
-        <w:rPr>
-          <w:b/>
-          <w:bCs/>
-          <w:sz w:val="24"/>
-          <w:szCs w:val="24"/>
-          <w:lang w:bidi="ar-EG"/>
-        </w:rPr>
-        <w:t xml:space="preserve">      (#)</w:t>
-      </w:r>
-    </w:p>
-    <w:p>
-      <w:pPr>
-        <w:rPr>
-          <w:b/>
-          <w:bCs/>
-          <w:sz w:val="24"/>
-          <w:szCs w:val="24"/>
-          <w:rtl/>
-          <w:lang w:bidi="ar-EG"/>
-        </w:rPr>
-      </w:pPr>
-    </w:p>
-    <w:p>
-      <w:pPr>
-        <w:bidi/>
-        <w:rPr>
-          <w:b/>
-          <w:bCs/>
-          <w:sz w:val="24"/>
-          <w:szCs w:val="24"/>
-          <w:rtl/>
-          <w:lang w:bidi="ar-EG"/>
-        </w:rPr>
-      </w:pPr>
-    </w:p>
-    <w:p>
-      <w:pPr>
-        <w:bidi/>
-        <w:rPr>
-          <w:b/>
-          <w:bCs/>
-          <w:sz w:val="24"/>
-          <w:szCs w:val="24"/>
-          <w:rtl/>
-          <w:lang w:bidi="ar-EG"/>
-        </w:rPr>
-      </w:pPr>
-    </w:p>
-    <w:p>
-      <w:pPr>
-        <w:bidi/>
-        <w:rPr>
-          <w:b/>
-          <w:bCs/>
-          <w:sz w:val="24"/>
-          <w:szCs w:val="24"/>
-          <w:rtl/>
-          <w:lang w:bidi="ar-EG"/>
-        </w:rPr>
-      </w:pPr>
-    </w:p>
-    <w:p>
-      <w:pPr>
-        <w:bidi/>
-        <w:rPr>
-          <w:b/>
-          <w:bCs/>
-          <w:sz w:val="28"/>
-          <w:szCs w:val="28"/>
-          <w:u w:val="single"/>
-        </w:rPr>
-      </w:pPr>
-      <w:r>
-        <w:rPr>
-          <w:rFonts w:hint="cs"/>
-          <w:b/>
-          <w:bCs/>
-          <w:sz w:val="28"/>
-          <w:szCs w:val="28"/>
-          <w:u w:val="single"/>
-          <w:rtl/>
-        </w:rPr>
-        <w:t>ايميلات للاستخدام كوتا اضافية</w:t>
-      </w:r>
-    </w:p>
-    <w:p>
-      <w:pPr>
-        <w:bidi/>
-        <w:jc w:val="right"/>
-      </w:pPr>
-      <w:r>
-        <w:t>hzayed3030@hotmail</w:t>
-      </w:r>
-    </w:p>
-    <w:p>
-      <w:pPr>
-        <w:bidi/>
-        <w:jc w:val="right"/>
-      </w:pPr>
-      <w:r>
-        <w:rPr>
-          <w:rFonts w:hint="cs"/>
-          <w:rtl/>
-        </w:rPr>
-        <w:t xml:space="preserve">تم تغييره كما في </w:t>
-      </w:r>
-      <w:r>
-        <w:t>1 pass</w:t>
-      </w:r>
-    </w:p>
-    <w:p>
-      <w:pPr>
-        <w:bidi/>
-        <w:jc w:val="right"/>
-      </w:pPr>
-      <w:r>
-        <w:t>hzayed1010@gmail</w:t>
-      </w:r>
-    </w:p>
-    <w:p>
-      <w:pPr>
-        <w:bidi/>
-        <w:jc w:val="right"/>
-      </w:pPr>
-      <w:r>
-        <w:t>6boFT*YffZeqEiQV6hBP</w:t>
-      </w:r>
-    </w:p>
-    <w:p>
-      <w:pPr>
-        <w:bidi/>
-        <w:jc w:val="right"/>
-      </w:pPr>
-      <w:r>
-        <w:t>hzayed4600@gmail.com</w:t>
-      </w:r>
-    </w:p>
-    <w:p>
-      <w:pPr>
-        <w:bidi/>
-        <w:jc w:val="right"/>
-      </w:pPr>
-      <w:proofErr w:type="spellStart"/>
-      <w:r>
-        <w:t>QQQqqq</w:t>
-      </w:r>
-      <w:proofErr w:type="spellEnd"/>
-      <w:r>
-        <w:t>@@4600</w:t>
-      </w:r>
-    </w:p>
-    <w:p>
-      <w:pPr>
-        <w:bidi/>
-        <w:jc w:val="right"/>
-      </w:pPr>
-      <w:r>
-        <w:t>hbody2005@gmail.com</w:t>
-      </w:r>
-    </w:p>
-    <w:p>
-      <w:pPr>
-        <w:bidi/>
-        <w:jc w:val="right"/>
-      </w:pPr>
-      <w:proofErr w:type="spellStart"/>
-      <w:r>
-        <w:t>QQQqqq</w:t>
-      </w:r>
-      <w:proofErr w:type="spellEnd"/>
-      <w:r>
-        <w:t>@@88 - Mobile 01223976846</w:t>
-      </w:r>
-    </w:p>
-    <w:p>
-      <w:pPr>
-        <w:bidi/>
-        <w:jc w:val="right"/>
-      </w:pPr>
-      <w:r>
-        <w:t>hmabmohamed1994</w:t>
-      </w:r>
-    </w:p>
-    <w:p>
-      <w:pPr>
-        <w:bidi/>
-        <w:jc w:val="right"/>
-        <w:rPr>
-          <w:rtl/>
-        </w:rPr>
-      </w:pPr>
-      <w:proofErr w:type="spellStart"/>
-      <w:r>
-        <w:t>QQQqqq</w:t>
-      </w:r>
-      <w:proofErr w:type="spellEnd"/>
-      <w:r>
-        <w:t>@@88 - Mobile 01020232244</w:t>
-      </w:r>
-    </w:p>
-    <w:p>
-      <w:pPr>
-        <w:bidi/>
-      </w:pPr>
+          <w:rFonts w:hint="cs"/>
+          <w:rtl/>
+          <w:lang w:bidi="ar-EG"/>
+        </w:rPr>
+        <w:t xml:space="preserve">في شاشة </w:t>
+      </w:r>
+      <w:r>
+        <w:rPr>
+          <w:lang w:bidi="ar-EG"/>
+        </w:rPr>
+        <w:t>CMD</w:t>
+      </w:r>
+      <w:r>
+        <w:rPr>
+          <w:rFonts w:hint="cs"/>
+          <w:rtl/>
+          <w:lang w:bidi="ar-EG"/>
+        </w:rPr>
+        <w:t xml:space="preserve"> السوداء نكتب</w:t>
+      </w:r>
+    </w:p>
+    <w:p>
+      <w:pPr>
+        <w:rPr>
+          <w:lang w:bidi="ar-EG"/>
+        </w:rPr>
+      </w:pPr>
+    </w:p>
+    <w:p>
+      <w:pPr>
+        <w:rPr>
+          <w:lang w:bidi="ar-EG"/>
+        </w:rPr>
+      </w:pPr>
+      <w:r>
+        <w:rPr>
+          <w:lang w:bidi="ar-EG"/>
+        </w:rPr>
+        <w:t xml:space="preserve">F: / </w:t>
+      </w:r>
+      <w:r>
+        <w:rPr>
+          <w:lang w:bidi="ar-EG"/>
+        </w:rPr>
+        <w:t xml:space="preserve">git clone </w:t>
+      </w:r>
+      <w:hyperlink r:id="rId8" w:history="1">
+        <w:r>
+          <w:rPr>
+            <w:rStyle w:val="Hyperlink"/>
+            <w:lang w:bidi="ar-EG"/>
+          </w:rPr>
+          <w:t>https://github.com/hzayed3030-cell/testing.git</w:t>
+        </w:r>
+      </w:hyperlink>
+    </w:p>
+    <w:p>
+      <w:pPr>
+        <w:rPr>
+          <w:rFonts w:hint="cs"/>
+          <w:rtl/>
+          <w:lang w:bidi="ar-EG"/>
+        </w:rPr>
+      </w:pPr>
+      <w:r>
+        <w:rPr>
+          <w:rFonts w:hint="cs"/>
+          <w:rtl/>
+          <w:lang w:bidi="ar-EG"/>
+        </w:rPr>
+        <w:t>ستظهر رسائل</w:t>
+      </w:r>
+    </w:p>
+    <w:p>
+      <w:pPr>
+        <w:rPr>
+          <w:lang w:bidi="ar-EG"/>
+        </w:rPr>
+      </w:pPr>
+      <w:r>
+        <w:rPr>
+          <w:lang w:bidi="ar-EG"/>
+        </w:rPr>
+        <w:t>Cloning into 'testing'...</w:t>
+      </w:r>
+    </w:p>
+    <w:p>
+      <w:pPr>
+        <w:rPr>
+          <w:lang w:bidi="ar-EG"/>
+        </w:rPr>
+      </w:pPr>
+      <w:r>
+        <w:rPr>
+          <w:lang w:bidi="ar-EG"/>
+        </w:rPr>
+        <w:t>warning: You appear to have cloned an empty repository.</w:t>
+      </w:r>
+    </w:p>
+    <w:p>
+      <w:pPr>
+        <w:bidi/>
+        <w:rPr>
+          <w:rtl/>
+          <w:lang w:bidi="ar-EG"/>
+        </w:rPr>
+      </w:pPr>
+      <w:r>
+        <w:rPr>
+          <w:rFonts w:hint="cs"/>
+          <w:rtl/>
+          <w:lang w:bidi="ar-EG"/>
+        </w:rPr>
+        <w:t>في المتصفح</w:t>
+      </w:r>
+      <w:r>
+        <w:rPr>
+          <w:lang w:bidi="ar-EG"/>
+        </w:rPr>
+        <w:t xml:space="preserve"> </w:t>
+      </w:r>
+      <w:r>
+        <w:rPr>
+          <w:rFonts w:hint="cs"/>
+          <w:rtl/>
+          <w:lang w:bidi="ar-EG"/>
+        </w:rPr>
+        <w:t xml:space="preserve">  سيظهر اسم الفولدر </w:t>
+      </w:r>
+      <w:r>
+        <w:rPr>
+          <w:lang w:bidi="ar-EG"/>
+        </w:rPr>
+        <w:t xml:space="preserve">testing </w:t>
+      </w:r>
+      <w:r>
+        <w:rPr>
+          <w:rFonts w:hint="cs"/>
+          <w:rtl/>
+          <w:lang w:bidi="ar-EG"/>
+        </w:rPr>
+        <w:t xml:space="preserve"> ونفتح رؤية الملفت المخفية من المتصفح لنري فولدؤ باسم </w:t>
+      </w:r>
+      <w:r>
+        <w:rPr>
+          <w:lang w:bidi="ar-EG"/>
+        </w:rPr>
+        <w:t>git</w:t>
+      </w:r>
+      <w:r>
+        <w:rPr>
+          <w:rFonts w:hint="cs"/>
+          <w:rtl/>
+          <w:lang w:bidi="ar-EG"/>
+        </w:rPr>
+        <w:t xml:space="preserve"> </w:t>
+      </w:r>
+    </w:p>
+    <w:p>
+      <w:pPr>
+        <w:bidi/>
+        <w:rPr>
+          <w:rtl/>
+          <w:lang w:bidi="ar-EG"/>
+        </w:rPr>
+      </w:pPr>
+      <w:r>
+        <w:rPr>
+          <w:rFonts w:hint="cs"/>
+          <w:rtl/>
+          <w:lang w:bidi="ar-EG"/>
+        </w:rPr>
+        <w:t xml:space="preserve">ثم نفتح </w:t>
+      </w:r>
+      <w:r>
+        <w:rPr>
+          <w:lang w:bidi="ar-EG"/>
+        </w:rPr>
+        <w:t>AntiGravity</w:t>
+      </w:r>
+      <w:r>
+        <w:rPr>
+          <w:rFonts w:hint="cs"/>
+          <w:rtl/>
+          <w:lang w:bidi="ar-EG"/>
+        </w:rPr>
+        <w:t xml:space="preserve"> علي فولدر </w:t>
+      </w:r>
+      <w:r>
+        <w:rPr>
+          <w:lang w:bidi="ar-EG"/>
+        </w:rPr>
+        <w:t xml:space="preserve">testing </w:t>
+      </w:r>
+      <w:r>
+        <w:rPr>
+          <w:rFonts w:hint="cs"/>
+          <w:rtl/>
+          <w:lang w:bidi="ar-EG"/>
+        </w:rPr>
+        <w:t xml:space="preserve"> ونعمل الكود المطلوب</w:t>
+      </w:r>
+    </w:p>
+    <w:p>
+      <w:pPr>
+        <w:bidi/>
+        <w:rPr>
+          <w:rtl/>
+          <w:lang w:bidi="ar-EG"/>
+        </w:rPr>
+      </w:pPr>
+      <w:r>
+        <w:rPr>
+          <w:rFonts w:hint="cs"/>
+          <w:rtl/>
+          <w:lang w:bidi="ar-EG"/>
+        </w:rPr>
+        <w:t>ثم لرفع بيانات الكود والتصميم نكتب كما سبق الثلا اوامر</w:t>
+      </w:r>
+    </w:p>
+    <w:p>
+      <w:pPr>
+        <w:spacing w:after="0" w:line="240" w:lineRule="auto"/>
+        <w:rPr>
+          <w:rFonts w:cs="Arial"/>
+          <w:b/>
+          <w:bCs/>
+          <w:color w:val="0070C0"/>
+          <w:sz w:val="28"/>
+          <w:szCs w:val="28"/>
+          <w:u w:val="single"/>
+          <w:lang w:bidi="ar-EG"/>
+        </w:rPr>
+      </w:pPr>
+      <w:r>
+        <w:rPr>
+          <w:b/>
+          <w:bCs/>
+          <w:color w:val="0070C0"/>
+          <w:sz w:val="28"/>
+          <w:szCs w:val="28"/>
+          <w:u w:val="single"/>
+          <w:lang w:bidi="ar-EG"/>
+        </w:rPr>
+        <w:t>git add</w:t>
+      </w:r>
+      <w:r>
+        <w:rPr>
+          <w:rFonts w:cs="Arial"/>
+          <w:b/>
+          <w:bCs/>
+          <w:color w:val="0070C0"/>
+          <w:sz w:val="28"/>
+          <w:szCs w:val="28"/>
+          <w:u w:val="single"/>
+          <w:rtl/>
+          <w:lang w:bidi="ar-EG"/>
+        </w:rPr>
+        <w:t xml:space="preserve"> .</w:t>
+      </w:r>
+    </w:p>
+    <w:p>
+      <w:pPr>
+        <w:bidi/>
+        <w:spacing w:after="0" w:line="240" w:lineRule="auto"/>
+        <w:rPr>
+          <w:rFonts w:cs="Arial"/>
+          <w:sz w:val="24"/>
+          <w:szCs w:val="24"/>
+          <w:rtl/>
+          <w:lang w:bidi="ar-EG"/>
+        </w:rPr>
+      </w:pPr>
+      <w:r>
+        <w:rPr>
+          <w:rFonts w:cs="Arial" w:hint="cs"/>
+          <w:sz w:val="24"/>
+          <w:szCs w:val="24"/>
+          <w:rtl/>
+          <w:lang w:bidi="ar-EG"/>
+        </w:rPr>
+        <w:t xml:space="preserve">يعطي عدة تحذيرات </w:t>
+      </w:r>
+      <w:r>
+        <w:rPr>
+          <w:rFonts w:cs="Arial"/>
+          <w:sz w:val="24"/>
+          <w:szCs w:val="24"/>
+          <w:lang w:bidi="ar-EG"/>
+        </w:rPr>
+        <w:t xml:space="preserve"> Warning </w:t>
+      </w:r>
+      <w:r>
+        <w:rPr>
+          <w:rFonts w:cs="Arial" w:hint="cs"/>
+          <w:sz w:val="24"/>
+          <w:szCs w:val="24"/>
+          <w:rtl/>
+          <w:lang w:bidi="ar-EG"/>
+        </w:rPr>
+        <w:t xml:space="preserve">بانه سيت استبدال الملفات في ال </w:t>
+      </w:r>
+      <w:r>
+        <w:rPr>
+          <w:rFonts w:cs="Arial"/>
+          <w:sz w:val="24"/>
+          <w:szCs w:val="24"/>
+          <w:lang w:bidi="ar-EG"/>
+        </w:rPr>
+        <w:t>Git Hub</w:t>
+      </w:r>
+      <w:r>
+        <w:rPr>
+          <w:rFonts w:cs="Arial" w:hint="cs"/>
+          <w:sz w:val="24"/>
+          <w:szCs w:val="24"/>
+          <w:rtl/>
+          <w:lang w:bidi="ar-EG"/>
+        </w:rPr>
+        <w:t xml:space="preserve"> بملفات جديدة</w:t>
+      </w:r>
+    </w:p>
+    <w:p>
+      <w:pPr>
+        <w:spacing w:after="0" w:line="240" w:lineRule="auto"/>
+        <w:rPr>
+          <w:b/>
+          <w:bCs/>
+          <w:color w:val="0070C0"/>
+          <w:sz w:val="28"/>
+          <w:szCs w:val="28"/>
+          <w:u w:val="single"/>
+          <w:rtl/>
+          <w:lang w:bidi="ar-EG"/>
+        </w:rPr>
+      </w:pPr>
+      <w:r>
+        <w:rPr>
+          <w:b/>
+          <w:bCs/>
+          <w:color w:val="0070C0"/>
+          <w:sz w:val="28"/>
+          <w:szCs w:val="28"/>
+          <w:u w:val="single"/>
+          <w:lang w:bidi="ar-EG"/>
+        </w:rPr>
+        <w:t>git commit -m "Added features"</w:t>
+      </w:r>
+    </w:p>
+    <w:p>
+      <w:pPr>
+        <w:bidi/>
+        <w:spacing w:after="0" w:line="240" w:lineRule="auto"/>
+        <w:rPr>
+          <w:rFonts w:cs="Arial"/>
+          <w:sz w:val="24"/>
+          <w:szCs w:val="24"/>
+          <w:lang w:bidi="ar-EG"/>
+        </w:rPr>
+      </w:pPr>
+      <w:r>
+        <w:rPr>
+          <w:rFonts w:cs="Arial" w:hint="cs"/>
+          <w:sz w:val="24"/>
+          <w:szCs w:val="24"/>
+          <w:rtl/>
+          <w:lang w:bidi="ar-EG"/>
+        </w:rPr>
+        <w:t xml:space="preserve">يعطي اخطارات عن </w:t>
+      </w:r>
+      <w:r>
+        <w:rPr>
+          <w:rFonts w:cs="Arial"/>
+          <w:sz w:val="24"/>
+          <w:szCs w:val="24"/>
+          <w:lang w:bidi="ar-EG"/>
+        </w:rPr>
+        <w:t>Create Modes</w:t>
+      </w:r>
+      <w:r>
+        <w:rPr>
+          <w:rFonts w:cs="Arial" w:hint="cs"/>
+          <w:sz w:val="24"/>
+          <w:szCs w:val="24"/>
+          <w:rtl/>
+          <w:lang w:bidi="ar-EG"/>
+        </w:rPr>
+        <w:t xml:space="preserve"> </w:t>
+      </w:r>
+      <w:r>
+        <w:rPr>
+          <w:rFonts w:cs="Arial"/>
+          <w:sz w:val="24"/>
+          <w:szCs w:val="24"/>
+          <w:lang w:bidi="ar-EG"/>
+        </w:rPr>
+        <w:t xml:space="preserve"> </w:t>
+      </w:r>
+    </w:p>
+    <w:p>
+      <w:pPr>
+        <w:spacing w:after="0" w:line="240" w:lineRule="auto"/>
+        <w:rPr>
+          <w:b/>
+          <w:bCs/>
+          <w:color w:val="0070C0"/>
+          <w:sz w:val="28"/>
+          <w:szCs w:val="28"/>
+          <w:u w:val="single"/>
+          <w:lang w:bidi="ar-EG"/>
+        </w:rPr>
+      </w:pPr>
+      <w:r>
+        <w:rPr>
+          <w:b/>
+          <w:bCs/>
+          <w:color w:val="0070C0"/>
+          <w:sz w:val="28"/>
+          <w:szCs w:val="28"/>
+          <w:u w:val="single"/>
+          <w:lang w:bidi="ar-EG"/>
+        </w:rPr>
+        <w:t>git push</w:t>
+      </w:r>
+    </w:p>
+    <w:p>
+      <w:pPr>
+        <w:bidi/>
+        <w:rPr>
+          <w:rFonts w:cs="Arial"/>
+          <w:sz w:val="24"/>
+          <w:szCs w:val="24"/>
+          <w:rtl/>
+          <w:lang w:bidi="ar-EG"/>
+        </w:rPr>
+      </w:pPr>
+      <w:r>
+        <w:rPr>
+          <w:rFonts w:cs="Arial" w:hint="cs"/>
+          <w:sz w:val="24"/>
+          <w:szCs w:val="24"/>
+          <w:rtl/>
+          <w:lang w:bidi="ar-EG"/>
+        </w:rPr>
+        <w:t>يقوم بالتنفيذ</w:t>
+      </w:r>
+    </w:p>
+    <w:p>
+      <w:pPr>
+        <w:rPr>
+          <w:rFonts w:hint="cs"/>
+          <w:rtl/>
+          <w:lang w:bidi="ar-EG"/>
+        </w:rPr>
+      </w:pPr>
+    </w:p>
+    <w:p>
+      <w:pPr>
+        <w:bidi/>
+        <w:rPr>
+          <w:rFonts w:hint="cs"/>
+          <w:lang w:bidi="ar-EG"/>
+        </w:rPr>
+      </w:pPr>
+      <w:r>
+        <w:rPr>
+          <w:rFonts w:hint="cs"/>
+          <w:rtl/>
+          <w:lang w:bidi="ar-EG"/>
+        </w:rPr>
+        <w:t xml:space="preserve"> </w:t>
+      </w:r>
     </w:p>
     <w:sectPr>
       <w:pgSz w:w="12240" w:h="15840"/>
@@ -2364,6 +3114,7 @@
   <w:style w:type="paragraph" w:default="1" w:styleId="Normal">
     <w:name w:val="Normal"/>
     <w:qFormat/>
+    <w:rsid w:val="00491B5B"/>
   </w:style>
   <w:style w:type="character" w:default="1" w:styleId="DefaultParagraphFont">
     <w:name w:val="Default Paragraph Font"/>

</xml_diff>